<commit_message>
Ajout d'une couverture illustrée pour la version française (PDF + DOCX)
Applique la couverture illustrée en pleine page comme page de titre des
quatre sorties françaises (livre complet et version « français facile »,
PDF et DOCX), en reprenant le motif déjà validé pour la version anglaise.

Co-Authored-By: Claude Sonnet 5 <noreply@anthropic.com>
Claude-Session: https://claude.ai/code/session_016YUsTGkJ7s85TXfcngyaWu
</commit_message>
<xml_diff>
--- a/la-paix-on-peut-leviter-facile.docx
+++ b/la-paix-on-peut-leviter-facile.docx
@@ -2,129 +2,60 @@
 <file path=word/document.xml><?xml version="1.0" encoding="utf-8"?>
 <w:document xmlns:wpc="http://schemas.microsoft.com/office/word/2010/wordprocessingCanvas" xmlns:mo="http://schemas.microsoft.com/office/mac/office/2008/main" xmlns:mc="http://schemas.openxmlformats.org/markup-compatibility/2006" xmlns:mv="urn:schemas-microsoft-com:mac:vml" xmlns:o="urn:schemas-microsoft-com:office:office" xmlns:r="http://schemas.openxmlformats.org/officeDocument/2006/relationships" xmlns:m="http://schemas.openxmlformats.org/officeDocument/2006/math" xmlns:v="urn:schemas-microsoft-com:vml" xmlns:wp14="http://schemas.microsoft.com/office/word/2010/wordprocessingDrawing" xmlns:wp="http://schemas.openxmlformats.org/drawingml/2006/wordprocessingDrawing" xmlns:w10="urn:schemas-microsoft-com:office:word" xmlns:w="http://schemas.openxmlformats.org/wordprocessingml/2006/main" xmlns:w14="http://schemas.microsoft.com/office/word/2010/wordml" xmlns:wpg="http://schemas.microsoft.com/office/word/2010/wordprocessingGroup" xmlns:wpi="http://schemas.microsoft.com/office/word/2010/wordprocessingInk" xmlns:wne="http://schemas.microsoft.com/office/word/2006/wordml" xmlns:wps="http://schemas.microsoft.com/office/word/2010/wordprocessingShape" mc:Ignorable="w14 wp14">
   <w:body>
-    <w:tbl>
-      <w:tblPr>
-        <w:tblW w:type="auto" w:w="0"/>
+    <w:p>
+      <w:pPr>
+        <w:spacing w:before="0" w:after="0"/>
         <w:jc w:val="center"/>
-        <w:tblLayout w:type="fixed"/>
-        <w:tblLook w:firstColumn="1" w:firstRow="1" w:lastColumn="0" w:lastRow="0" w:noHBand="0" w:noVBand="1" w:val="04A0"/>
-      </w:tblPr>
-      <w:tblGrid>
-        <w:gridCol w:w="9354"/>
-      </w:tblGrid>
-      <w:tr>
-        <w:trPr>
-          <w:trHeight w:val="14003" w:hRule="atLeast"/>
-        </w:trPr>
-        <w:tc>
-          <w:tcPr>
-            <w:tcW w:type="dxa" w:w="9354"/>
-            <w:shd w:val="clear" w:color="auto" w:fill="2C3A4A"/>
-            <w:vAlign w:val="center"/>
-            <w:tcBorders>
-              <w:insideV w:val="none" w:sz="0" w:space="0" w:color="auto"/>
-              <w:left w:val="none" w:sz="0" w:space="0" w:color="auto"/>
-              <w:bottom w:val="none" w:sz="0" w:space="0" w:color="auto"/>
-              <w:top w:val="none" w:sz="0" w:space="0" w:color="auto"/>
-              <w:insideH w:val="none" w:sz="0" w:space="0" w:color="auto"/>
-              <w:right w:val="none" w:sz="0" w:space="0" w:color="auto"/>
-            </w:tcBorders>
-          </w:tcPr>
-          <w:p>
-            <w:pPr>
-              <w:spacing w:after="480"/>
-              <w:jc w:val="center"/>
-            </w:pPr>
-            <w:r>
-              <w:rPr>
-                <w:rFonts w:ascii="FreeSerif" w:hAnsi="FreeSerif"/>
-                <w:b/>
-                <w:caps/>
-                <w:color w:val="FFFFFF"/>
-                <w:sz w:val="49"/>
-              </w:rPr>
-              <w:t>LA PAIX, ON PEUT L'ÉVITER</w:t>
-            </w:r>
-          </w:p>
-          <w:p>
-            <w:pPr>
-              <w:spacing w:after="200"/>
-              <w:jc w:val="center"/>
-            </w:pPr>
-            <w:r>
-              <w:rPr>
-                <w:rFonts w:ascii="FreeSerif" w:hAnsi="FreeSerif"/>
-                <w:b/>
-                <w:color w:val="A07820"/>
-                <w:sz w:val="30"/>
-              </w:rPr>
-              <w:t>Version en français facile</w:t>
-            </w:r>
-          </w:p>
-          <w:p>
-            <w:pPr>
-              <w:spacing w:after="800"/>
-              <w:jc w:val="center"/>
-            </w:pPr>
-            <w:r>
-              <w:rPr>
-                <w:rFonts w:ascii="FreeSerif" w:hAnsi="FreeSerif"/>
-                <w:i/>
-                <w:color w:val="A07820"/>
-                <w:sz w:val="26"/>
-              </w:rPr>
-              <w:t>Enquête sur la naissance de l'Alliance des États du Sahel</w:t>
-            </w:r>
-          </w:p>
-          <w:p>
-            <w:pPr>
-              <w:spacing w:after="200"/>
-              <w:jc w:val="center"/>
-            </w:pPr>
-            <w:r>
-              <w:rPr>
-                <w:rFonts w:ascii="FreeSerif" w:hAnsi="FreeSerif"/>
-                <w:b/>
-                <w:color w:val="FFFFFF"/>
-                <w:sz w:val="34"/>
-              </w:rPr>
-              <w:t>BEN–H2O</w:t>
-            </w:r>
-          </w:p>
-          <w:p>
-            <w:pPr>
-              <w:spacing w:after="1200"/>
-              <w:jc w:val="center"/>
-            </w:pPr>
-            <w:r>
-              <w:rPr>
-                <w:rFonts w:ascii="FreeSerif" w:hAnsi="FreeSerif"/>
-                <w:color w:val="A07820"/>
-                <w:sz w:val="22"/>
-              </w:rPr>
-              <w:t>— 2026 —</w:t>
-            </w:r>
-          </w:p>
-          <w:p>
-            <w:pPr>
-              <w:jc w:val="center"/>
-            </w:pPr>
-            <w:r>
-              <w:rPr>
-                <w:rFonts w:ascii="FreeSerif" w:hAnsi="FreeSerif"/>
-                <w:color w:val="A07820"/>
-                <w:sz w:val="18"/>
-              </w:rPr>
-              <w:t>© 2026 BEN–H2O — Tous droits réservés.</w:t>
-            </w:r>
-          </w:p>
-        </w:tc>
-      </w:tr>
-    </w:tbl>
-    <w:p>
-      <w:r>
-        <w:br w:type="page"/>
-      </w:r>
+      </w:pPr>
+      <w:r>
+        <w:drawing>
+          <wp:inline xmlns:a="http://schemas.openxmlformats.org/drawingml/2006/main" xmlns:pic="http://schemas.openxmlformats.org/drawingml/2006/picture">
+            <wp:extent cx="7560000" cy="10692000"/>
+            <wp:docPr id="1" name="Picture 1"/>
+            <wp:cNvGraphicFramePr>
+              <a:graphicFrameLocks noChangeAspect="1"/>
+            </wp:cNvGraphicFramePr>
+            <a:graphic>
+              <a:graphicData uri="http://schemas.openxmlformats.org/drawingml/2006/picture">
+                <pic:pic>
+                  <pic:nvPicPr>
+                    <pic:cNvPr id="0" name="cover-fr.jpg"/>
+                    <pic:cNvPicPr/>
+                  </pic:nvPicPr>
+                  <pic:blipFill>
+                    <a:blip r:embed="rId11"/>
+                    <a:stretch>
+                      <a:fillRect/>
+                    </a:stretch>
+                  </pic:blipFill>
+                  <pic:spPr>
+                    <a:xfrm>
+                      <a:off x="0" y="0"/>
+                      <a:ext cx="7560000" cy="10692000"/>
+                    </a:xfrm>
+                    <a:prstGeom prst="rect"/>
+                  </pic:spPr>
+                </pic:pic>
+              </a:graphicData>
+            </a:graphic>
+          </wp:inline>
+        </w:drawing>
+      </w:r>
+    </w:p>
+    <w:p>
+      <w:pPr>
+        <w:sectPr>
+          <w:headerReference w:type="default" r:id="rId9"/>
+          <w:footerReference w:type="default" r:id="rId10"/>
+          <w:headerReference w:type="first" r:id="rId12"/>
+          <w:footerReference w:type="first" r:id="rId13"/>
+          <w:pgSz w:w="11906" w:h="16838"/>
+          <w:pgMar w:top="0" w:right="0" w:bottom="0" w:left="0" w:header="720" w:footer="720" w:gutter="0"/>
+          <w:cols w:space="720"/>
+          <w:titlePg/>
+          <w:docGrid w:linePitch="360"/>
+        </w:sectPr>
+      </w:pPr>
     </w:p>
     <w:p>
       <w:pPr>
@@ -988,10 +919,6 @@
     <w:p>
       <w:pPr>
         <w:sectPr>
-          <w:headerReference w:type="default" r:id="rId9"/>
-          <w:footerReference w:type="default" r:id="rId10"/>
-          <w:headerReference w:type="first" r:id="rId11"/>
-          <w:footerReference w:type="first" r:id="rId12"/>
           <w:pgSz w:w="11906" w:h="16838"/>
           <w:pgMar w:top="1417" w:right="1134" w:bottom="1417" w:left="1417" w:header="720" w:footer="720" w:gutter="0"/>
           <w:cols w:space="720"/>
@@ -1046,11 +973,11 @@
             <w:tcW w:type="dxa" w:w="4535"/>
             <w:tcBorders>
               <w:bottom w:val="single" w:sz="12" w:space="0" w:color="A07820"/>
+              <w:right w:val="none" w:sz="0" w:space="0" w:color="auto"/>
+              <w:left w:val="none" w:sz="0" w:space="0" w:color="auto"/>
+              <w:insideH w:val="none" w:sz="0" w:space="0" w:color="auto"/>
               <w:top w:val="none" w:sz="0" w:space="0" w:color="auto"/>
               <w:insideV w:val="none" w:sz="0" w:space="0" w:color="auto"/>
-              <w:left w:val="none" w:sz="0" w:space="0" w:color="auto"/>
-              <w:insideH w:val="none" w:sz="0" w:space="0" w:color="auto"/>
-              <w:right w:val="none" w:sz="0" w:space="0" w:color="auto"/>
             </w:tcBorders>
           </w:tcPr>
           <w:p>
@@ -2757,12 +2684,12 @@
           <w:tcPr>
             <w:tcW w:type="dxa" w:w="4677"/>
             <w:tcBorders>
+              <w:top w:val="none" w:sz="0" w:space="0" w:color="auto"/>
+              <w:right w:val="none" w:sz="0" w:space="0" w:color="auto"/>
+              <w:bottom w:val="none" w:sz="0" w:space="0" w:color="auto"/>
+              <w:left w:val="none" w:sz="0" w:space="0" w:color="auto"/>
+              <w:insideH w:val="none" w:sz="0" w:space="0" w:color="auto"/>
               <w:insideV w:val="none" w:sz="0" w:space="0" w:color="auto"/>
-              <w:left w:val="none" w:sz="0" w:space="0" w:color="auto"/>
-              <w:bottom w:val="none" w:sz="0" w:space="0" w:color="auto"/>
-              <w:top w:val="none" w:sz="0" w:space="0" w:color="auto"/>
-              <w:insideH w:val="none" w:sz="0" w:space="0" w:color="auto"/>
-              <w:right w:val="none" w:sz="0" w:space="0" w:color="auto"/>
             </w:tcBorders>
           </w:tcPr>
           <w:p>
@@ -2784,12 +2711,12 @@
           <w:tcPr>
             <w:tcW w:type="dxa" w:w="4677"/>
             <w:tcBorders>
+              <w:top w:val="none" w:sz="0" w:space="0" w:color="auto"/>
+              <w:right w:val="none" w:sz="0" w:space="0" w:color="auto"/>
+              <w:bottom w:val="none" w:sz="0" w:space="0" w:color="auto"/>
+              <w:left w:val="none" w:sz="0" w:space="0" w:color="auto"/>
+              <w:insideH w:val="none" w:sz="0" w:space="0" w:color="auto"/>
               <w:insideV w:val="none" w:sz="0" w:space="0" w:color="auto"/>
-              <w:left w:val="none" w:sz="0" w:space="0" w:color="auto"/>
-              <w:bottom w:val="none" w:sz="0" w:space="0" w:color="auto"/>
-              <w:top w:val="none" w:sz="0" w:space="0" w:color="auto"/>
-              <w:insideH w:val="none" w:sz="0" w:space="0" w:color="auto"/>
-              <w:right w:val="none" w:sz="0" w:space="0" w:color="auto"/>
             </w:tcBorders>
           </w:tcPr>
           <w:p>
@@ -2829,11 +2756,11 @@
             <w:tcW w:type="dxa" w:w="4677"/>
             <w:tcBorders>
               <w:right w:val="single" w:sz="4" w:space="0" w:color="2C3A4A"/>
+              <w:left w:val="none" w:sz="0" w:space="0" w:color="auto"/>
+              <w:insideH w:val="none" w:sz="0" w:space="0" w:color="auto"/>
               <w:top w:val="none" w:sz="0" w:space="0" w:color="auto"/>
+              <w:bottom w:val="none" w:sz="0" w:space="0" w:color="auto"/>
               <w:insideV w:val="none" w:sz="0" w:space="0" w:color="auto"/>
-              <w:left w:val="none" w:sz="0" w:space="0" w:color="auto"/>
-              <w:bottom w:val="none" w:sz="0" w:space="0" w:color="auto"/>
-              <w:insideH w:val="none" w:sz="0" w:space="0" w:color="auto"/>
             </w:tcBorders>
           </w:tcPr>
           <w:p>
@@ -2864,11 +2791,11 @@
             <w:tcW w:type="dxa" w:w="4677"/>
             <w:tcBorders>
               <w:left w:val="single" w:sz="4" w:space="0" w:color="2C3A4A"/>
+              <w:right w:val="none" w:sz="0" w:space="0" w:color="auto"/>
+              <w:insideH w:val="none" w:sz="0" w:space="0" w:color="auto"/>
               <w:top w:val="none" w:sz="0" w:space="0" w:color="auto"/>
+              <w:bottom w:val="none" w:sz="0" w:space="0" w:color="auto"/>
               <w:insideV w:val="none" w:sz="0" w:space="0" w:color="auto"/>
-              <w:bottom w:val="none" w:sz="0" w:space="0" w:color="auto"/>
-              <w:insideH w:val="none" w:sz="0" w:space="0" w:color="auto"/>
-              <w:right w:val="none" w:sz="0" w:space="0" w:color="auto"/>
             </w:tcBorders>
           </w:tcPr>
           <w:p>
@@ -2892,11 +2819,11 @@
             <w:tcW w:type="dxa" w:w="4677"/>
             <w:tcBorders>
               <w:right w:val="single" w:sz="4" w:space="0" w:color="2C3A4A"/>
+              <w:left w:val="none" w:sz="0" w:space="0" w:color="auto"/>
+              <w:insideH w:val="none" w:sz="0" w:space="0" w:color="auto"/>
               <w:top w:val="none" w:sz="0" w:space="0" w:color="auto"/>
+              <w:bottom w:val="none" w:sz="0" w:space="0" w:color="auto"/>
               <w:insideV w:val="none" w:sz="0" w:space="0" w:color="auto"/>
-              <w:left w:val="none" w:sz="0" w:space="0" w:color="auto"/>
-              <w:bottom w:val="none" w:sz="0" w:space="0" w:color="auto"/>
-              <w:insideH w:val="none" w:sz="0" w:space="0" w:color="auto"/>
             </w:tcBorders>
           </w:tcPr>
           <w:p>
@@ -2927,11 +2854,11 @@
             <w:tcW w:type="dxa" w:w="4677"/>
             <w:tcBorders>
               <w:left w:val="single" w:sz="4" w:space="0" w:color="2C3A4A"/>
+              <w:right w:val="none" w:sz="0" w:space="0" w:color="auto"/>
+              <w:insideH w:val="none" w:sz="0" w:space="0" w:color="auto"/>
               <w:top w:val="none" w:sz="0" w:space="0" w:color="auto"/>
+              <w:bottom w:val="none" w:sz="0" w:space="0" w:color="auto"/>
               <w:insideV w:val="none" w:sz="0" w:space="0" w:color="auto"/>
-              <w:bottom w:val="none" w:sz="0" w:space="0" w:color="auto"/>
-              <w:insideH w:val="none" w:sz="0" w:space="0" w:color="auto"/>
-              <w:right w:val="none" w:sz="0" w:space="0" w:color="auto"/>
             </w:tcBorders>
           </w:tcPr>
           <w:p>
@@ -2955,11 +2882,11 @@
             <w:tcW w:type="dxa" w:w="4677"/>
             <w:tcBorders>
               <w:right w:val="single" w:sz="4" w:space="0" w:color="2C3A4A"/>
+              <w:left w:val="none" w:sz="0" w:space="0" w:color="auto"/>
+              <w:insideH w:val="none" w:sz="0" w:space="0" w:color="auto"/>
               <w:top w:val="none" w:sz="0" w:space="0" w:color="auto"/>
+              <w:bottom w:val="none" w:sz="0" w:space="0" w:color="auto"/>
               <w:insideV w:val="none" w:sz="0" w:space="0" w:color="auto"/>
-              <w:left w:val="none" w:sz="0" w:space="0" w:color="auto"/>
-              <w:bottom w:val="none" w:sz="0" w:space="0" w:color="auto"/>
-              <w:insideH w:val="none" w:sz="0" w:space="0" w:color="auto"/>
             </w:tcBorders>
           </w:tcPr>
           <w:p>
@@ -2990,11 +2917,11 @@
             <w:tcW w:type="dxa" w:w="4677"/>
             <w:tcBorders>
               <w:left w:val="single" w:sz="4" w:space="0" w:color="2C3A4A"/>
+              <w:right w:val="none" w:sz="0" w:space="0" w:color="auto"/>
+              <w:insideH w:val="none" w:sz="0" w:space="0" w:color="auto"/>
               <w:top w:val="none" w:sz="0" w:space="0" w:color="auto"/>
+              <w:bottom w:val="none" w:sz="0" w:space="0" w:color="auto"/>
               <w:insideV w:val="none" w:sz="0" w:space="0" w:color="auto"/>
-              <w:bottom w:val="none" w:sz="0" w:space="0" w:color="auto"/>
-              <w:insideH w:val="none" w:sz="0" w:space="0" w:color="auto"/>
-              <w:right w:val="none" w:sz="0" w:space="0" w:color="auto"/>
             </w:tcBorders>
           </w:tcPr>
           <w:p>
@@ -3018,11 +2945,11 @@
             <w:tcW w:type="dxa" w:w="4677"/>
             <w:tcBorders>
               <w:right w:val="single" w:sz="4" w:space="0" w:color="2C3A4A"/>
+              <w:left w:val="none" w:sz="0" w:space="0" w:color="auto"/>
+              <w:insideH w:val="none" w:sz="0" w:space="0" w:color="auto"/>
               <w:top w:val="none" w:sz="0" w:space="0" w:color="auto"/>
+              <w:bottom w:val="none" w:sz="0" w:space="0" w:color="auto"/>
               <w:insideV w:val="none" w:sz="0" w:space="0" w:color="auto"/>
-              <w:left w:val="none" w:sz="0" w:space="0" w:color="auto"/>
-              <w:bottom w:val="none" w:sz="0" w:space="0" w:color="auto"/>
-              <w:insideH w:val="none" w:sz="0" w:space="0" w:color="auto"/>
             </w:tcBorders>
           </w:tcPr>
           <w:p>
@@ -3053,11 +2980,11 @@
             <w:tcW w:type="dxa" w:w="4677"/>
             <w:tcBorders>
               <w:left w:val="single" w:sz="4" w:space="0" w:color="2C3A4A"/>
+              <w:right w:val="none" w:sz="0" w:space="0" w:color="auto"/>
+              <w:insideH w:val="none" w:sz="0" w:space="0" w:color="auto"/>
               <w:top w:val="none" w:sz="0" w:space="0" w:color="auto"/>
+              <w:bottom w:val="none" w:sz="0" w:space="0" w:color="auto"/>
               <w:insideV w:val="none" w:sz="0" w:space="0" w:color="auto"/>
-              <w:bottom w:val="none" w:sz="0" w:space="0" w:color="auto"/>
-              <w:insideH w:val="none" w:sz="0" w:space="0" w:color="auto"/>
-              <w:right w:val="none" w:sz="0" w:space="0" w:color="auto"/>
             </w:tcBorders>
           </w:tcPr>
           <w:p>
@@ -4376,11 +4303,11 @@
             <w:tcW w:type="dxa" w:w="4535"/>
             <w:tcBorders>
               <w:bottom w:val="single" w:sz="12" w:space="0" w:color="A07820"/>
+              <w:right w:val="none" w:sz="0" w:space="0" w:color="auto"/>
+              <w:left w:val="none" w:sz="0" w:space="0" w:color="auto"/>
+              <w:insideH w:val="none" w:sz="0" w:space="0" w:color="auto"/>
               <w:top w:val="none" w:sz="0" w:space="0" w:color="auto"/>
               <w:insideV w:val="none" w:sz="0" w:space="0" w:color="auto"/>
-              <w:left w:val="none" w:sz="0" w:space="0" w:color="auto"/>
-              <w:insideH w:val="none" w:sz="0" w:space="0" w:color="auto"/>
-              <w:right w:val="none" w:sz="0" w:space="0" w:color="auto"/>
             </w:tcBorders>
           </w:tcPr>
           <w:p>
@@ -5823,12 +5750,12 @@
           <w:tcPr>
             <w:tcW w:type="dxa" w:w="4677"/>
             <w:tcBorders>
+              <w:top w:val="none" w:sz="0" w:space="0" w:color="auto"/>
+              <w:right w:val="none" w:sz="0" w:space="0" w:color="auto"/>
+              <w:bottom w:val="none" w:sz="0" w:space="0" w:color="auto"/>
+              <w:left w:val="none" w:sz="0" w:space="0" w:color="auto"/>
+              <w:insideH w:val="none" w:sz="0" w:space="0" w:color="auto"/>
               <w:insideV w:val="none" w:sz="0" w:space="0" w:color="auto"/>
-              <w:left w:val="none" w:sz="0" w:space="0" w:color="auto"/>
-              <w:bottom w:val="none" w:sz="0" w:space="0" w:color="auto"/>
-              <w:top w:val="none" w:sz="0" w:space="0" w:color="auto"/>
-              <w:insideH w:val="none" w:sz="0" w:space="0" w:color="auto"/>
-              <w:right w:val="none" w:sz="0" w:space="0" w:color="auto"/>
             </w:tcBorders>
           </w:tcPr>
           <w:p>
@@ -5850,12 +5777,12 @@
           <w:tcPr>
             <w:tcW w:type="dxa" w:w="4677"/>
             <w:tcBorders>
+              <w:top w:val="none" w:sz="0" w:space="0" w:color="auto"/>
+              <w:right w:val="none" w:sz="0" w:space="0" w:color="auto"/>
+              <w:bottom w:val="none" w:sz="0" w:space="0" w:color="auto"/>
+              <w:left w:val="none" w:sz="0" w:space="0" w:color="auto"/>
+              <w:insideH w:val="none" w:sz="0" w:space="0" w:color="auto"/>
               <w:insideV w:val="none" w:sz="0" w:space="0" w:color="auto"/>
-              <w:left w:val="none" w:sz="0" w:space="0" w:color="auto"/>
-              <w:bottom w:val="none" w:sz="0" w:space="0" w:color="auto"/>
-              <w:top w:val="none" w:sz="0" w:space="0" w:color="auto"/>
-              <w:insideH w:val="none" w:sz="0" w:space="0" w:color="auto"/>
-              <w:right w:val="none" w:sz="0" w:space="0" w:color="auto"/>
             </w:tcBorders>
           </w:tcPr>
           <w:p>
@@ -5895,11 +5822,11 @@
             <w:tcW w:type="dxa" w:w="4677"/>
             <w:tcBorders>
               <w:right w:val="single" w:sz="4" w:space="0" w:color="2C3A4A"/>
+              <w:left w:val="none" w:sz="0" w:space="0" w:color="auto"/>
+              <w:insideH w:val="none" w:sz="0" w:space="0" w:color="auto"/>
               <w:top w:val="none" w:sz="0" w:space="0" w:color="auto"/>
+              <w:bottom w:val="none" w:sz="0" w:space="0" w:color="auto"/>
               <w:insideV w:val="none" w:sz="0" w:space="0" w:color="auto"/>
-              <w:left w:val="none" w:sz="0" w:space="0" w:color="auto"/>
-              <w:bottom w:val="none" w:sz="0" w:space="0" w:color="auto"/>
-              <w:insideH w:val="none" w:sz="0" w:space="0" w:color="auto"/>
             </w:tcBorders>
           </w:tcPr>
           <w:p>
@@ -5930,11 +5857,11 @@
             <w:tcW w:type="dxa" w:w="4677"/>
             <w:tcBorders>
               <w:left w:val="single" w:sz="4" w:space="0" w:color="2C3A4A"/>
+              <w:right w:val="none" w:sz="0" w:space="0" w:color="auto"/>
+              <w:insideH w:val="none" w:sz="0" w:space="0" w:color="auto"/>
               <w:top w:val="none" w:sz="0" w:space="0" w:color="auto"/>
+              <w:bottom w:val="none" w:sz="0" w:space="0" w:color="auto"/>
               <w:insideV w:val="none" w:sz="0" w:space="0" w:color="auto"/>
-              <w:bottom w:val="none" w:sz="0" w:space="0" w:color="auto"/>
-              <w:insideH w:val="none" w:sz="0" w:space="0" w:color="auto"/>
-              <w:right w:val="none" w:sz="0" w:space="0" w:color="auto"/>
             </w:tcBorders>
           </w:tcPr>
           <w:p>
@@ -5958,11 +5885,11 @@
             <w:tcW w:type="dxa" w:w="4677"/>
             <w:tcBorders>
               <w:right w:val="single" w:sz="4" w:space="0" w:color="2C3A4A"/>
+              <w:left w:val="none" w:sz="0" w:space="0" w:color="auto"/>
+              <w:insideH w:val="none" w:sz="0" w:space="0" w:color="auto"/>
               <w:top w:val="none" w:sz="0" w:space="0" w:color="auto"/>
+              <w:bottom w:val="none" w:sz="0" w:space="0" w:color="auto"/>
               <w:insideV w:val="none" w:sz="0" w:space="0" w:color="auto"/>
-              <w:left w:val="none" w:sz="0" w:space="0" w:color="auto"/>
-              <w:bottom w:val="none" w:sz="0" w:space="0" w:color="auto"/>
-              <w:insideH w:val="none" w:sz="0" w:space="0" w:color="auto"/>
             </w:tcBorders>
           </w:tcPr>
           <w:p>
@@ -5993,11 +5920,11 @@
             <w:tcW w:type="dxa" w:w="4677"/>
             <w:tcBorders>
               <w:left w:val="single" w:sz="4" w:space="0" w:color="2C3A4A"/>
+              <w:right w:val="none" w:sz="0" w:space="0" w:color="auto"/>
+              <w:insideH w:val="none" w:sz="0" w:space="0" w:color="auto"/>
               <w:top w:val="none" w:sz="0" w:space="0" w:color="auto"/>
+              <w:bottom w:val="none" w:sz="0" w:space="0" w:color="auto"/>
               <w:insideV w:val="none" w:sz="0" w:space="0" w:color="auto"/>
-              <w:bottom w:val="none" w:sz="0" w:space="0" w:color="auto"/>
-              <w:insideH w:val="none" w:sz="0" w:space="0" w:color="auto"/>
-              <w:right w:val="none" w:sz="0" w:space="0" w:color="auto"/>
             </w:tcBorders>
           </w:tcPr>
           <w:p>
@@ -6021,11 +5948,11 @@
             <w:tcW w:type="dxa" w:w="4677"/>
             <w:tcBorders>
               <w:right w:val="single" w:sz="4" w:space="0" w:color="2C3A4A"/>
+              <w:left w:val="none" w:sz="0" w:space="0" w:color="auto"/>
+              <w:insideH w:val="none" w:sz="0" w:space="0" w:color="auto"/>
               <w:top w:val="none" w:sz="0" w:space="0" w:color="auto"/>
+              <w:bottom w:val="none" w:sz="0" w:space="0" w:color="auto"/>
               <w:insideV w:val="none" w:sz="0" w:space="0" w:color="auto"/>
-              <w:left w:val="none" w:sz="0" w:space="0" w:color="auto"/>
-              <w:bottom w:val="none" w:sz="0" w:space="0" w:color="auto"/>
-              <w:insideH w:val="none" w:sz="0" w:space="0" w:color="auto"/>
             </w:tcBorders>
           </w:tcPr>
           <w:p>
@@ -6056,11 +5983,11 @@
             <w:tcW w:type="dxa" w:w="4677"/>
             <w:tcBorders>
               <w:left w:val="single" w:sz="4" w:space="0" w:color="2C3A4A"/>
+              <w:right w:val="none" w:sz="0" w:space="0" w:color="auto"/>
+              <w:insideH w:val="none" w:sz="0" w:space="0" w:color="auto"/>
               <w:top w:val="none" w:sz="0" w:space="0" w:color="auto"/>
+              <w:bottom w:val="none" w:sz="0" w:space="0" w:color="auto"/>
               <w:insideV w:val="none" w:sz="0" w:space="0" w:color="auto"/>
-              <w:bottom w:val="none" w:sz="0" w:space="0" w:color="auto"/>
-              <w:insideH w:val="none" w:sz="0" w:space="0" w:color="auto"/>
-              <w:right w:val="none" w:sz="0" w:space="0" w:color="auto"/>
             </w:tcBorders>
           </w:tcPr>
           <w:p>
@@ -6084,11 +6011,11 @@
             <w:tcW w:type="dxa" w:w="4677"/>
             <w:tcBorders>
               <w:right w:val="single" w:sz="4" w:space="0" w:color="2C3A4A"/>
+              <w:left w:val="none" w:sz="0" w:space="0" w:color="auto"/>
+              <w:insideH w:val="none" w:sz="0" w:space="0" w:color="auto"/>
               <w:top w:val="none" w:sz="0" w:space="0" w:color="auto"/>
+              <w:bottom w:val="none" w:sz="0" w:space="0" w:color="auto"/>
               <w:insideV w:val="none" w:sz="0" w:space="0" w:color="auto"/>
-              <w:left w:val="none" w:sz="0" w:space="0" w:color="auto"/>
-              <w:bottom w:val="none" w:sz="0" w:space="0" w:color="auto"/>
-              <w:insideH w:val="none" w:sz="0" w:space="0" w:color="auto"/>
             </w:tcBorders>
           </w:tcPr>
           <w:p>
@@ -6119,11 +6046,11 @@
             <w:tcW w:type="dxa" w:w="4677"/>
             <w:tcBorders>
               <w:left w:val="single" w:sz="4" w:space="0" w:color="2C3A4A"/>
+              <w:right w:val="none" w:sz="0" w:space="0" w:color="auto"/>
+              <w:insideH w:val="none" w:sz="0" w:space="0" w:color="auto"/>
               <w:top w:val="none" w:sz="0" w:space="0" w:color="auto"/>
+              <w:bottom w:val="none" w:sz="0" w:space="0" w:color="auto"/>
               <w:insideV w:val="none" w:sz="0" w:space="0" w:color="auto"/>
-              <w:bottom w:val="none" w:sz="0" w:space="0" w:color="auto"/>
-              <w:insideH w:val="none" w:sz="0" w:space="0" w:color="auto"/>
-              <w:right w:val="none" w:sz="0" w:space="0" w:color="auto"/>
             </w:tcBorders>
           </w:tcPr>
           <w:p>
@@ -6147,11 +6074,11 @@
             <w:tcW w:type="dxa" w:w="4677"/>
             <w:tcBorders>
               <w:right w:val="single" w:sz="4" w:space="0" w:color="2C3A4A"/>
+              <w:left w:val="none" w:sz="0" w:space="0" w:color="auto"/>
+              <w:insideH w:val="none" w:sz="0" w:space="0" w:color="auto"/>
               <w:top w:val="none" w:sz="0" w:space="0" w:color="auto"/>
+              <w:bottom w:val="none" w:sz="0" w:space="0" w:color="auto"/>
               <w:insideV w:val="none" w:sz="0" w:space="0" w:color="auto"/>
-              <w:left w:val="none" w:sz="0" w:space="0" w:color="auto"/>
-              <w:bottom w:val="none" w:sz="0" w:space="0" w:color="auto"/>
-              <w:insideH w:val="none" w:sz="0" w:space="0" w:color="auto"/>
             </w:tcBorders>
           </w:tcPr>
           <w:p>
@@ -6182,11 +6109,11 @@
             <w:tcW w:type="dxa" w:w="4677"/>
             <w:tcBorders>
               <w:left w:val="single" w:sz="4" w:space="0" w:color="2C3A4A"/>
+              <w:right w:val="none" w:sz="0" w:space="0" w:color="auto"/>
+              <w:insideH w:val="none" w:sz="0" w:space="0" w:color="auto"/>
               <w:top w:val="none" w:sz="0" w:space="0" w:color="auto"/>
+              <w:bottom w:val="none" w:sz="0" w:space="0" w:color="auto"/>
               <w:insideV w:val="none" w:sz="0" w:space="0" w:color="auto"/>
-              <w:bottom w:val="none" w:sz="0" w:space="0" w:color="auto"/>
-              <w:insideH w:val="none" w:sz="0" w:space="0" w:color="auto"/>
-              <w:right w:val="none" w:sz="0" w:space="0" w:color="auto"/>
             </w:tcBorders>
           </w:tcPr>
           <w:p>
@@ -6538,12 +6465,12 @@
           <w:tcPr>
             <w:tcW w:type="dxa" w:w="4677"/>
             <w:tcBorders>
+              <w:top w:val="none" w:sz="0" w:space="0" w:color="auto"/>
+              <w:right w:val="none" w:sz="0" w:space="0" w:color="auto"/>
+              <w:bottom w:val="none" w:sz="0" w:space="0" w:color="auto"/>
+              <w:left w:val="none" w:sz="0" w:space="0" w:color="auto"/>
+              <w:insideH w:val="none" w:sz="0" w:space="0" w:color="auto"/>
               <w:insideV w:val="none" w:sz="0" w:space="0" w:color="auto"/>
-              <w:left w:val="none" w:sz="0" w:space="0" w:color="auto"/>
-              <w:bottom w:val="none" w:sz="0" w:space="0" w:color="auto"/>
-              <w:top w:val="none" w:sz="0" w:space="0" w:color="auto"/>
-              <w:insideH w:val="none" w:sz="0" w:space="0" w:color="auto"/>
-              <w:right w:val="none" w:sz="0" w:space="0" w:color="auto"/>
             </w:tcBorders>
           </w:tcPr>
           <w:p>
@@ -6565,12 +6492,12 @@
           <w:tcPr>
             <w:tcW w:type="dxa" w:w="4677"/>
             <w:tcBorders>
+              <w:top w:val="none" w:sz="0" w:space="0" w:color="auto"/>
+              <w:right w:val="none" w:sz="0" w:space="0" w:color="auto"/>
+              <w:bottom w:val="none" w:sz="0" w:space="0" w:color="auto"/>
+              <w:left w:val="none" w:sz="0" w:space="0" w:color="auto"/>
+              <w:insideH w:val="none" w:sz="0" w:space="0" w:color="auto"/>
               <w:insideV w:val="none" w:sz="0" w:space="0" w:color="auto"/>
-              <w:left w:val="none" w:sz="0" w:space="0" w:color="auto"/>
-              <w:bottom w:val="none" w:sz="0" w:space="0" w:color="auto"/>
-              <w:top w:val="none" w:sz="0" w:space="0" w:color="auto"/>
-              <w:insideH w:val="none" w:sz="0" w:space="0" w:color="auto"/>
-              <w:right w:val="none" w:sz="0" w:space="0" w:color="auto"/>
             </w:tcBorders>
           </w:tcPr>
           <w:p>
@@ -6610,11 +6537,11 @@
             <w:tcW w:type="dxa" w:w="4677"/>
             <w:tcBorders>
               <w:right w:val="single" w:sz="4" w:space="0" w:color="2C3A4A"/>
+              <w:left w:val="none" w:sz="0" w:space="0" w:color="auto"/>
+              <w:insideH w:val="none" w:sz="0" w:space="0" w:color="auto"/>
               <w:top w:val="none" w:sz="0" w:space="0" w:color="auto"/>
+              <w:bottom w:val="none" w:sz="0" w:space="0" w:color="auto"/>
               <w:insideV w:val="none" w:sz="0" w:space="0" w:color="auto"/>
-              <w:left w:val="none" w:sz="0" w:space="0" w:color="auto"/>
-              <w:bottom w:val="none" w:sz="0" w:space="0" w:color="auto"/>
-              <w:insideH w:val="none" w:sz="0" w:space="0" w:color="auto"/>
             </w:tcBorders>
           </w:tcPr>
           <w:p>
@@ -6645,11 +6572,11 @@
             <w:tcW w:type="dxa" w:w="4677"/>
             <w:tcBorders>
               <w:left w:val="single" w:sz="4" w:space="0" w:color="2C3A4A"/>
+              <w:right w:val="none" w:sz="0" w:space="0" w:color="auto"/>
+              <w:insideH w:val="none" w:sz="0" w:space="0" w:color="auto"/>
               <w:top w:val="none" w:sz="0" w:space="0" w:color="auto"/>
+              <w:bottom w:val="none" w:sz="0" w:space="0" w:color="auto"/>
               <w:insideV w:val="none" w:sz="0" w:space="0" w:color="auto"/>
-              <w:bottom w:val="none" w:sz="0" w:space="0" w:color="auto"/>
-              <w:insideH w:val="none" w:sz="0" w:space="0" w:color="auto"/>
-              <w:right w:val="none" w:sz="0" w:space="0" w:color="auto"/>
             </w:tcBorders>
           </w:tcPr>
           <w:p>
@@ -6673,11 +6600,11 @@
             <w:tcW w:type="dxa" w:w="4677"/>
             <w:tcBorders>
               <w:right w:val="single" w:sz="4" w:space="0" w:color="2C3A4A"/>
+              <w:left w:val="none" w:sz="0" w:space="0" w:color="auto"/>
+              <w:insideH w:val="none" w:sz="0" w:space="0" w:color="auto"/>
               <w:top w:val="none" w:sz="0" w:space="0" w:color="auto"/>
+              <w:bottom w:val="none" w:sz="0" w:space="0" w:color="auto"/>
               <w:insideV w:val="none" w:sz="0" w:space="0" w:color="auto"/>
-              <w:left w:val="none" w:sz="0" w:space="0" w:color="auto"/>
-              <w:bottom w:val="none" w:sz="0" w:space="0" w:color="auto"/>
-              <w:insideH w:val="none" w:sz="0" w:space="0" w:color="auto"/>
             </w:tcBorders>
           </w:tcPr>
           <w:p>
@@ -6708,11 +6635,11 @@
             <w:tcW w:type="dxa" w:w="4677"/>
             <w:tcBorders>
               <w:left w:val="single" w:sz="4" w:space="0" w:color="2C3A4A"/>
+              <w:right w:val="none" w:sz="0" w:space="0" w:color="auto"/>
+              <w:insideH w:val="none" w:sz="0" w:space="0" w:color="auto"/>
               <w:top w:val="none" w:sz="0" w:space="0" w:color="auto"/>
+              <w:bottom w:val="none" w:sz="0" w:space="0" w:color="auto"/>
               <w:insideV w:val="none" w:sz="0" w:space="0" w:color="auto"/>
-              <w:bottom w:val="none" w:sz="0" w:space="0" w:color="auto"/>
-              <w:insideH w:val="none" w:sz="0" w:space="0" w:color="auto"/>
-              <w:right w:val="none" w:sz="0" w:space="0" w:color="auto"/>
             </w:tcBorders>
           </w:tcPr>
           <w:p>
@@ -6736,11 +6663,11 @@
             <w:tcW w:type="dxa" w:w="4677"/>
             <w:tcBorders>
               <w:right w:val="single" w:sz="4" w:space="0" w:color="2C3A4A"/>
+              <w:left w:val="none" w:sz="0" w:space="0" w:color="auto"/>
+              <w:insideH w:val="none" w:sz="0" w:space="0" w:color="auto"/>
               <w:top w:val="none" w:sz="0" w:space="0" w:color="auto"/>
+              <w:bottom w:val="none" w:sz="0" w:space="0" w:color="auto"/>
               <w:insideV w:val="none" w:sz="0" w:space="0" w:color="auto"/>
-              <w:left w:val="none" w:sz="0" w:space="0" w:color="auto"/>
-              <w:bottom w:val="none" w:sz="0" w:space="0" w:color="auto"/>
-              <w:insideH w:val="none" w:sz="0" w:space="0" w:color="auto"/>
             </w:tcBorders>
           </w:tcPr>
           <w:p>
@@ -6771,11 +6698,11 @@
             <w:tcW w:type="dxa" w:w="4677"/>
             <w:tcBorders>
               <w:left w:val="single" w:sz="4" w:space="0" w:color="2C3A4A"/>
+              <w:right w:val="none" w:sz="0" w:space="0" w:color="auto"/>
+              <w:insideH w:val="none" w:sz="0" w:space="0" w:color="auto"/>
               <w:top w:val="none" w:sz="0" w:space="0" w:color="auto"/>
+              <w:bottom w:val="none" w:sz="0" w:space="0" w:color="auto"/>
               <w:insideV w:val="none" w:sz="0" w:space="0" w:color="auto"/>
-              <w:bottom w:val="none" w:sz="0" w:space="0" w:color="auto"/>
-              <w:insideH w:val="none" w:sz="0" w:space="0" w:color="auto"/>
-              <w:right w:val="none" w:sz="0" w:space="0" w:color="auto"/>
             </w:tcBorders>
           </w:tcPr>
           <w:p>
@@ -6799,11 +6726,11 @@
             <w:tcW w:type="dxa" w:w="4677"/>
             <w:tcBorders>
               <w:right w:val="single" w:sz="4" w:space="0" w:color="2C3A4A"/>
+              <w:left w:val="none" w:sz="0" w:space="0" w:color="auto"/>
+              <w:insideH w:val="none" w:sz="0" w:space="0" w:color="auto"/>
               <w:top w:val="none" w:sz="0" w:space="0" w:color="auto"/>
+              <w:bottom w:val="none" w:sz="0" w:space="0" w:color="auto"/>
               <w:insideV w:val="none" w:sz="0" w:space="0" w:color="auto"/>
-              <w:left w:val="none" w:sz="0" w:space="0" w:color="auto"/>
-              <w:bottom w:val="none" w:sz="0" w:space="0" w:color="auto"/>
-              <w:insideH w:val="none" w:sz="0" w:space="0" w:color="auto"/>
             </w:tcBorders>
           </w:tcPr>
           <w:p>
@@ -6834,11 +6761,11 @@
             <w:tcW w:type="dxa" w:w="4677"/>
             <w:tcBorders>
               <w:left w:val="single" w:sz="4" w:space="0" w:color="2C3A4A"/>
+              <w:right w:val="none" w:sz="0" w:space="0" w:color="auto"/>
+              <w:insideH w:val="none" w:sz="0" w:space="0" w:color="auto"/>
               <w:top w:val="none" w:sz="0" w:space="0" w:color="auto"/>
+              <w:bottom w:val="none" w:sz="0" w:space="0" w:color="auto"/>
               <w:insideV w:val="none" w:sz="0" w:space="0" w:color="auto"/>
-              <w:bottom w:val="none" w:sz="0" w:space="0" w:color="auto"/>
-              <w:insideH w:val="none" w:sz="0" w:space="0" w:color="auto"/>
-              <w:right w:val="none" w:sz="0" w:space="0" w:color="auto"/>
             </w:tcBorders>
           </w:tcPr>
           <w:p>
@@ -7880,12 +7807,12 @@
           <w:tcPr>
             <w:tcW w:type="dxa" w:w="4677"/>
             <w:tcBorders>
+              <w:top w:val="none" w:sz="0" w:space="0" w:color="auto"/>
+              <w:right w:val="none" w:sz="0" w:space="0" w:color="auto"/>
+              <w:bottom w:val="none" w:sz="0" w:space="0" w:color="auto"/>
+              <w:left w:val="none" w:sz="0" w:space="0" w:color="auto"/>
+              <w:insideH w:val="none" w:sz="0" w:space="0" w:color="auto"/>
               <w:insideV w:val="none" w:sz="0" w:space="0" w:color="auto"/>
-              <w:left w:val="none" w:sz="0" w:space="0" w:color="auto"/>
-              <w:bottom w:val="none" w:sz="0" w:space="0" w:color="auto"/>
-              <w:top w:val="none" w:sz="0" w:space="0" w:color="auto"/>
-              <w:insideH w:val="none" w:sz="0" w:space="0" w:color="auto"/>
-              <w:right w:val="none" w:sz="0" w:space="0" w:color="auto"/>
             </w:tcBorders>
           </w:tcPr>
           <w:p>
@@ -7907,12 +7834,12 @@
           <w:tcPr>
             <w:tcW w:type="dxa" w:w="4677"/>
             <w:tcBorders>
+              <w:top w:val="none" w:sz="0" w:space="0" w:color="auto"/>
+              <w:right w:val="none" w:sz="0" w:space="0" w:color="auto"/>
+              <w:bottom w:val="none" w:sz="0" w:space="0" w:color="auto"/>
+              <w:left w:val="none" w:sz="0" w:space="0" w:color="auto"/>
+              <w:insideH w:val="none" w:sz="0" w:space="0" w:color="auto"/>
               <w:insideV w:val="none" w:sz="0" w:space="0" w:color="auto"/>
-              <w:left w:val="none" w:sz="0" w:space="0" w:color="auto"/>
-              <w:bottom w:val="none" w:sz="0" w:space="0" w:color="auto"/>
-              <w:top w:val="none" w:sz="0" w:space="0" w:color="auto"/>
-              <w:insideH w:val="none" w:sz="0" w:space="0" w:color="auto"/>
-              <w:right w:val="none" w:sz="0" w:space="0" w:color="auto"/>
             </w:tcBorders>
           </w:tcPr>
           <w:p>
@@ -7952,11 +7879,11 @@
             <w:tcW w:type="dxa" w:w="4677"/>
             <w:tcBorders>
               <w:right w:val="single" w:sz="4" w:space="0" w:color="2C3A4A"/>
+              <w:left w:val="none" w:sz="0" w:space="0" w:color="auto"/>
+              <w:insideH w:val="none" w:sz="0" w:space="0" w:color="auto"/>
               <w:top w:val="none" w:sz="0" w:space="0" w:color="auto"/>
+              <w:bottom w:val="none" w:sz="0" w:space="0" w:color="auto"/>
               <w:insideV w:val="none" w:sz="0" w:space="0" w:color="auto"/>
-              <w:left w:val="none" w:sz="0" w:space="0" w:color="auto"/>
-              <w:bottom w:val="none" w:sz="0" w:space="0" w:color="auto"/>
-              <w:insideH w:val="none" w:sz="0" w:space="0" w:color="auto"/>
             </w:tcBorders>
           </w:tcPr>
           <w:p>
@@ -7987,11 +7914,11 @@
             <w:tcW w:type="dxa" w:w="4677"/>
             <w:tcBorders>
               <w:left w:val="single" w:sz="4" w:space="0" w:color="2C3A4A"/>
+              <w:right w:val="none" w:sz="0" w:space="0" w:color="auto"/>
+              <w:insideH w:val="none" w:sz="0" w:space="0" w:color="auto"/>
               <w:top w:val="none" w:sz="0" w:space="0" w:color="auto"/>
+              <w:bottom w:val="none" w:sz="0" w:space="0" w:color="auto"/>
               <w:insideV w:val="none" w:sz="0" w:space="0" w:color="auto"/>
-              <w:bottom w:val="none" w:sz="0" w:space="0" w:color="auto"/>
-              <w:insideH w:val="none" w:sz="0" w:space="0" w:color="auto"/>
-              <w:right w:val="none" w:sz="0" w:space="0" w:color="auto"/>
             </w:tcBorders>
           </w:tcPr>
           <w:p>
@@ -8015,11 +7942,11 @@
             <w:tcW w:type="dxa" w:w="4677"/>
             <w:tcBorders>
               <w:right w:val="single" w:sz="4" w:space="0" w:color="2C3A4A"/>
+              <w:left w:val="none" w:sz="0" w:space="0" w:color="auto"/>
+              <w:insideH w:val="none" w:sz="0" w:space="0" w:color="auto"/>
               <w:top w:val="none" w:sz="0" w:space="0" w:color="auto"/>
+              <w:bottom w:val="none" w:sz="0" w:space="0" w:color="auto"/>
               <w:insideV w:val="none" w:sz="0" w:space="0" w:color="auto"/>
-              <w:left w:val="none" w:sz="0" w:space="0" w:color="auto"/>
-              <w:bottom w:val="none" w:sz="0" w:space="0" w:color="auto"/>
-              <w:insideH w:val="none" w:sz="0" w:space="0" w:color="auto"/>
             </w:tcBorders>
           </w:tcPr>
           <w:p>
@@ -8050,11 +7977,11 @@
             <w:tcW w:type="dxa" w:w="4677"/>
             <w:tcBorders>
               <w:left w:val="single" w:sz="4" w:space="0" w:color="2C3A4A"/>
+              <w:right w:val="none" w:sz="0" w:space="0" w:color="auto"/>
+              <w:insideH w:val="none" w:sz="0" w:space="0" w:color="auto"/>
               <w:top w:val="none" w:sz="0" w:space="0" w:color="auto"/>
+              <w:bottom w:val="none" w:sz="0" w:space="0" w:color="auto"/>
               <w:insideV w:val="none" w:sz="0" w:space="0" w:color="auto"/>
-              <w:bottom w:val="none" w:sz="0" w:space="0" w:color="auto"/>
-              <w:insideH w:val="none" w:sz="0" w:space="0" w:color="auto"/>
-              <w:right w:val="none" w:sz="0" w:space="0" w:color="auto"/>
             </w:tcBorders>
           </w:tcPr>
           <w:p>
@@ -8078,11 +8005,11 @@
             <w:tcW w:type="dxa" w:w="4677"/>
             <w:tcBorders>
               <w:right w:val="single" w:sz="4" w:space="0" w:color="2C3A4A"/>
+              <w:left w:val="none" w:sz="0" w:space="0" w:color="auto"/>
+              <w:insideH w:val="none" w:sz="0" w:space="0" w:color="auto"/>
               <w:top w:val="none" w:sz="0" w:space="0" w:color="auto"/>
+              <w:bottom w:val="none" w:sz="0" w:space="0" w:color="auto"/>
               <w:insideV w:val="none" w:sz="0" w:space="0" w:color="auto"/>
-              <w:left w:val="none" w:sz="0" w:space="0" w:color="auto"/>
-              <w:bottom w:val="none" w:sz="0" w:space="0" w:color="auto"/>
-              <w:insideH w:val="none" w:sz="0" w:space="0" w:color="auto"/>
             </w:tcBorders>
           </w:tcPr>
           <w:p>
@@ -8113,11 +8040,11 @@
             <w:tcW w:type="dxa" w:w="4677"/>
             <w:tcBorders>
               <w:left w:val="single" w:sz="4" w:space="0" w:color="2C3A4A"/>
+              <w:right w:val="none" w:sz="0" w:space="0" w:color="auto"/>
+              <w:insideH w:val="none" w:sz="0" w:space="0" w:color="auto"/>
               <w:top w:val="none" w:sz="0" w:space="0" w:color="auto"/>
+              <w:bottom w:val="none" w:sz="0" w:space="0" w:color="auto"/>
               <w:insideV w:val="none" w:sz="0" w:space="0" w:color="auto"/>
-              <w:bottom w:val="none" w:sz="0" w:space="0" w:color="auto"/>
-              <w:insideH w:val="none" w:sz="0" w:space="0" w:color="auto"/>
-              <w:right w:val="none" w:sz="0" w:space="0" w:color="auto"/>
             </w:tcBorders>
           </w:tcPr>
           <w:p>
@@ -8141,11 +8068,11 @@
             <w:tcW w:type="dxa" w:w="4677"/>
             <w:tcBorders>
               <w:right w:val="single" w:sz="4" w:space="0" w:color="2C3A4A"/>
+              <w:left w:val="none" w:sz="0" w:space="0" w:color="auto"/>
+              <w:insideH w:val="none" w:sz="0" w:space="0" w:color="auto"/>
               <w:top w:val="none" w:sz="0" w:space="0" w:color="auto"/>
+              <w:bottom w:val="none" w:sz="0" w:space="0" w:color="auto"/>
               <w:insideV w:val="none" w:sz="0" w:space="0" w:color="auto"/>
-              <w:left w:val="none" w:sz="0" w:space="0" w:color="auto"/>
-              <w:bottom w:val="none" w:sz="0" w:space="0" w:color="auto"/>
-              <w:insideH w:val="none" w:sz="0" w:space="0" w:color="auto"/>
             </w:tcBorders>
           </w:tcPr>
           <w:p>
@@ -8176,11 +8103,11 @@
             <w:tcW w:type="dxa" w:w="4677"/>
             <w:tcBorders>
               <w:left w:val="single" w:sz="4" w:space="0" w:color="2C3A4A"/>
+              <w:right w:val="none" w:sz="0" w:space="0" w:color="auto"/>
+              <w:insideH w:val="none" w:sz="0" w:space="0" w:color="auto"/>
               <w:top w:val="none" w:sz="0" w:space="0" w:color="auto"/>
+              <w:bottom w:val="none" w:sz="0" w:space="0" w:color="auto"/>
               <w:insideV w:val="none" w:sz="0" w:space="0" w:color="auto"/>
-              <w:bottom w:val="none" w:sz="0" w:space="0" w:color="auto"/>
-              <w:insideH w:val="none" w:sz="0" w:space="0" w:color="auto"/>
-              <w:right w:val="none" w:sz="0" w:space="0" w:color="auto"/>
             </w:tcBorders>
           </w:tcPr>
           <w:p>
@@ -8204,11 +8131,11 @@
             <w:tcW w:type="dxa" w:w="4677"/>
             <w:tcBorders>
               <w:right w:val="single" w:sz="4" w:space="0" w:color="2C3A4A"/>
+              <w:left w:val="none" w:sz="0" w:space="0" w:color="auto"/>
+              <w:insideH w:val="none" w:sz="0" w:space="0" w:color="auto"/>
               <w:top w:val="none" w:sz="0" w:space="0" w:color="auto"/>
+              <w:bottom w:val="none" w:sz="0" w:space="0" w:color="auto"/>
               <w:insideV w:val="none" w:sz="0" w:space="0" w:color="auto"/>
-              <w:left w:val="none" w:sz="0" w:space="0" w:color="auto"/>
-              <w:bottom w:val="none" w:sz="0" w:space="0" w:color="auto"/>
-              <w:insideH w:val="none" w:sz="0" w:space="0" w:color="auto"/>
             </w:tcBorders>
           </w:tcPr>
           <w:p>
@@ -8239,11 +8166,11 @@
             <w:tcW w:type="dxa" w:w="4677"/>
             <w:tcBorders>
               <w:left w:val="single" w:sz="4" w:space="0" w:color="2C3A4A"/>
+              <w:right w:val="none" w:sz="0" w:space="0" w:color="auto"/>
+              <w:insideH w:val="none" w:sz="0" w:space="0" w:color="auto"/>
               <w:top w:val="none" w:sz="0" w:space="0" w:color="auto"/>
+              <w:bottom w:val="none" w:sz="0" w:space="0" w:color="auto"/>
               <w:insideV w:val="none" w:sz="0" w:space="0" w:color="auto"/>
-              <w:bottom w:val="none" w:sz="0" w:space="0" w:color="auto"/>
-              <w:insideH w:val="none" w:sz="0" w:space="0" w:color="auto"/>
-              <w:right w:val="none" w:sz="0" w:space="0" w:color="auto"/>
             </w:tcBorders>
           </w:tcPr>
           <w:p>
@@ -8267,11 +8194,11 @@
             <w:tcW w:type="dxa" w:w="4677"/>
             <w:tcBorders>
               <w:right w:val="single" w:sz="4" w:space="0" w:color="2C3A4A"/>
+              <w:left w:val="none" w:sz="0" w:space="0" w:color="auto"/>
+              <w:insideH w:val="none" w:sz="0" w:space="0" w:color="auto"/>
               <w:top w:val="none" w:sz="0" w:space="0" w:color="auto"/>
+              <w:bottom w:val="none" w:sz="0" w:space="0" w:color="auto"/>
               <w:insideV w:val="none" w:sz="0" w:space="0" w:color="auto"/>
-              <w:left w:val="none" w:sz="0" w:space="0" w:color="auto"/>
-              <w:bottom w:val="none" w:sz="0" w:space="0" w:color="auto"/>
-              <w:insideH w:val="none" w:sz="0" w:space="0" w:color="auto"/>
             </w:tcBorders>
           </w:tcPr>
           <w:p>
@@ -8302,11 +8229,11 @@
             <w:tcW w:type="dxa" w:w="4677"/>
             <w:tcBorders>
               <w:left w:val="single" w:sz="4" w:space="0" w:color="2C3A4A"/>
+              <w:right w:val="none" w:sz="0" w:space="0" w:color="auto"/>
+              <w:insideH w:val="none" w:sz="0" w:space="0" w:color="auto"/>
               <w:top w:val="none" w:sz="0" w:space="0" w:color="auto"/>
+              <w:bottom w:val="none" w:sz="0" w:space="0" w:color="auto"/>
               <w:insideV w:val="none" w:sz="0" w:space="0" w:color="auto"/>
-              <w:bottom w:val="none" w:sz="0" w:space="0" w:color="auto"/>
-              <w:insideH w:val="none" w:sz="0" w:space="0" w:color="auto"/>
-              <w:right w:val="none" w:sz="0" w:space="0" w:color="auto"/>
             </w:tcBorders>
           </w:tcPr>
           <w:p>
@@ -8330,11 +8257,11 @@
             <w:tcW w:type="dxa" w:w="4677"/>
             <w:tcBorders>
               <w:right w:val="single" w:sz="4" w:space="0" w:color="2C3A4A"/>
+              <w:left w:val="none" w:sz="0" w:space="0" w:color="auto"/>
+              <w:insideH w:val="none" w:sz="0" w:space="0" w:color="auto"/>
               <w:top w:val="none" w:sz="0" w:space="0" w:color="auto"/>
+              <w:bottom w:val="none" w:sz="0" w:space="0" w:color="auto"/>
               <w:insideV w:val="none" w:sz="0" w:space="0" w:color="auto"/>
-              <w:left w:val="none" w:sz="0" w:space="0" w:color="auto"/>
-              <w:bottom w:val="none" w:sz="0" w:space="0" w:color="auto"/>
-              <w:insideH w:val="none" w:sz="0" w:space="0" w:color="auto"/>
             </w:tcBorders>
           </w:tcPr>
           <w:p>
@@ -8365,11 +8292,11 @@
             <w:tcW w:type="dxa" w:w="4677"/>
             <w:tcBorders>
               <w:left w:val="single" w:sz="4" w:space="0" w:color="2C3A4A"/>
+              <w:right w:val="none" w:sz="0" w:space="0" w:color="auto"/>
+              <w:insideH w:val="none" w:sz="0" w:space="0" w:color="auto"/>
               <w:top w:val="none" w:sz="0" w:space="0" w:color="auto"/>
+              <w:bottom w:val="none" w:sz="0" w:space="0" w:color="auto"/>
               <w:insideV w:val="none" w:sz="0" w:space="0" w:color="auto"/>
-              <w:bottom w:val="none" w:sz="0" w:space="0" w:color="auto"/>
-              <w:insideH w:val="none" w:sz="0" w:space="0" w:color="auto"/>
-              <w:right w:val="none" w:sz="0" w:space="0" w:color="auto"/>
             </w:tcBorders>
           </w:tcPr>
           <w:p>
@@ -8393,11 +8320,11 @@
             <w:tcW w:type="dxa" w:w="4677"/>
             <w:tcBorders>
               <w:right w:val="single" w:sz="4" w:space="0" w:color="2C3A4A"/>
+              <w:left w:val="none" w:sz="0" w:space="0" w:color="auto"/>
+              <w:insideH w:val="none" w:sz="0" w:space="0" w:color="auto"/>
               <w:top w:val="none" w:sz="0" w:space="0" w:color="auto"/>
+              <w:bottom w:val="none" w:sz="0" w:space="0" w:color="auto"/>
               <w:insideV w:val="none" w:sz="0" w:space="0" w:color="auto"/>
-              <w:left w:val="none" w:sz="0" w:space="0" w:color="auto"/>
-              <w:bottom w:val="none" w:sz="0" w:space="0" w:color="auto"/>
-              <w:insideH w:val="none" w:sz="0" w:space="0" w:color="auto"/>
             </w:tcBorders>
           </w:tcPr>
           <w:p>
@@ -8428,11 +8355,11 @@
             <w:tcW w:type="dxa" w:w="4677"/>
             <w:tcBorders>
               <w:left w:val="single" w:sz="4" w:space="0" w:color="2C3A4A"/>
+              <w:right w:val="none" w:sz="0" w:space="0" w:color="auto"/>
+              <w:insideH w:val="none" w:sz="0" w:space="0" w:color="auto"/>
               <w:top w:val="none" w:sz="0" w:space="0" w:color="auto"/>
+              <w:bottom w:val="none" w:sz="0" w:space="0" w:color="auto"/>
               <w:insideV w:val="none" w:sz="0" w:space="0" w:color="auto"/>
-              <w:bottom w:val="none" w:sz="0" w:space="0" w:color="auto"/>
-              <w:insideH w:val="none" w:sz="0" w:space="0" w:color="auto"/>
-              <w:right w:val="none" w:sz="0" w:space="0" w:color="auto"/>
             </w:tcBorders>
           </w:tcPr>
           <w:p>
@@ -8456,11 +8383,11 @@
             <w:tcW w:type="dxa" w:w="4677"/>
             <w:tcBorders>
               <w:right w:val="single" w:sz="4" w:space="0" w:color="2C3A4A"/>
+              <w:left w:val="none" w:sz="0" w:space="0" w:color="auto"/>
+              <w:insideH w:val="none" w:sz="0" w:space="0" w:color="auto"/>
               <w:top w:val="none" w:sz="0" w:space="0" w:color="auto"/>
+              <w:bottom w:val="none" w:sz="0" w:space="0" w:color="auto"/>
               <w:insideV w:val="none" w:sz="0" w:space="0" w:color="auto"/>
-              <w:left w:val="none" w:sz="0" w:space="0" w:color="auto"/>
-              <w:bottom w:val="none" w:sz="0" w:space="0" w:color="auto"/>
-              <w:insideH w:val="none" w:sz="0" w:space="0" w:color="auto"/>
             </w:tcBorders>
           </w:tcPr>
           <w:p>
@@ -8491,11 +8418,11 @@
             <w:tcW w:type="dxa" w:w="4677"/>
             <w:tcBorders>
               <w:left w:val="single" w:sz="4" w:space="0" w:color="2C3A4A"/>
+              <w:right w:val="none" w:sz="0" w:space="0" w:color="auto"/>
+              <w:insideH w:val="none" w:sz="0" w:space="0" w:color="auto"/>
               <w:top w:val="none" w:sz="0" w:space="0" w:color="auto"/>
+              <w:bottom w:val="none" w:sz="0" w:space="0" w:color="auto"/>
               <w:insideV w:val="none" w:sz="0" w:space="0" w:color="auto"/>
-              <w:bottom w:val="none" w:sz="0" w:space="0" w:color="auto"/>
-              <w:insideH w:val="none" w:sz="0" w:space="0" w:color="auto"/>
-              <w:right w:val="none" w:sz="0" w:space="0" w:color="auto"/>
             </w:tcBorders>
           </w:tcPr>
           <w:p>
@@ -10457,12 +10384,12 @@
           <w:tcPr>
             <w:tcW w:type="dxa" w:w="4677"/>
             <w:tcBorders>
+              <w:top w:val="none" w:sz="0" w:space="0" w:color="auto"/>
+              <w:right w:val="none" w:sz="0" w:space="0" w:color="auto"/>
+              <w:bottom w:val="none" w:sz="0" w:space="0" w:color="auto"/>
+              <w:left w:val="none" w:sz="0" w:space="0" w:color="auto"/>
+              <w:insideH w:val="none" w:sz="0" w:space="0" w:color="auto"/>
               <w:insideV w:val="none" w:sz="0" w:space="0" w:color="auto"/>
-              <w:left w:val="none" w:sz="0" w:space="0" w:color="auto"/>
-              <w:bottom w:val="none" w:sz="0" w:space="0" w:color="auto"/>
-              <w:top w:val="none" w:sz="0" w:space="0" w:color="auto"/>
-              <w:insideH w:val="none" w:sz="0" w:space="0" w:color="auto"/>
-              <w:right w:val="none" w:sz="0" w:space="0" w:color="auto"/>
             </w:tcBorders>
           </w:tcPr>
           <w:p>
@@ -10484,12 +10411,12 @@
           <w:tcPr>
             <w:tcW w:type="dxa" w:w="4677"/>
             <w:tcBorders>
+              <w:top w:val="none" w:sz="0" w:space="0" w:color="auto"/>
+              <w:right w:val="none" w:sz="0" w:space="0" w:color="auto"/>
+              <w:bottom w:val="none" w:sz="0" w:space="0" w:color="auto"/>
+              <w:left w:val="none" w:sz="0" w:space="0" w:color="auto"/>
+              <w:insideH w:val="none" w:sz="0" w:space="0" w:color="auto"/>
               <w:insideV w:val="none" w:sz="0" w:space="0" w:color="auto"/>
-              <w:left w:val="none" w:sz="0" w:space="0" w:color="auto"/>
-              <w:bottom w:val="none" w:sz="0" w:space="0" w:color="auto"/>
-              <w:top w:val="none" w:sz="0" w:space="0" w:color="auto"/>
-              <w:insideH w:val="none" w:sz="0" w:space="0" w:color="auto"/>
-              <w:right w:val="none" w:sz="0" w:space="0" w:color="auto"/>
             </w:tcBorders>
           </w:tcPr>
           <w:p>
@@ -10529,11 +10456,11 @@
             <w:tcW w:type="dxa" w:w="4677"/>
             <w:tcBorders>
               <w:right w:val="single" w:sz="4" w:space="0" w:color="2C3A4A"/>
+              <w:left w:val="none" w:sz="0" w:space="0" w:color="auto"/>
+              <w:insideH w:val="none" w:sz="0" w:space="0" w:color="auto"/>
               <w:top w:val="none" w:sz="0" w:space="0" w:color="auto"/>
+              <w:bottom w:val="none" w:sz="0" w:space="0" w:color="auto"/>
               <w:insideV w:val="none" w:sz="0" w:space="0" w:color="auto"/>
-              <w:left w:val="none" w:sz="0" w:space="0" w:color="auto"/>
-              <w:bottom w:val="none" w:sz="0" w:space="0" w:color="auto"/>
-              <w:insideH w:val="none" w:sz="0" w:space="0" w:color="auto"/>
             </w:tcBorders>
           </w:tcPr>
           <w:p>
@@ -10564,11 +10491,11 @@
             <w:tcW w:type="dxa" w:w="4677"/>
             <w:tcBorders>
               <w:left w:val="single" w:sz="4" w:space="0" w:color="2C3A4A"/>
+              <w:right w:val="none" w:sz="0" w:space="0" w:color="auto"/>
+              <w:insideH w:val="none" w:sz="0" w:space="0" w:color="auto"/>
               <w:top w:val="none" w:sz="0" w:space="0" w:color="auto"/>
+              <w:bottom w:val="none" w:sz="0" w:space="0" w:color="auto"/>
               <w:insideV w:val="none" w:sz="0" w:space="0" w:color="auto"/>
-              <w:bottom w:val="none" w:sz="0" w:space="0" w:color="auto"/>
-              <w:insideH w:val="none" w:sz="0" w:space="0" w:color="auto"/>
-              <w:right w:val="none" w:sz="0" w:space="0" w:color="auto"/>
             </w:tcBorders>
           </w:tcPr>
           <w:p>
@@ -10592,11 +10519,11 @@
             <w:tcW w:type="dxa" w:w="4677"/>
             <w:tcBorders>
               <w:right w:val="single" w:sz="4" w:space="0" w:color="2C3A4A"/>
+              <w:left w:val="none" w:sz="0" w:space="0" w:color="auto"/>
+              <w:insideH w:val="none" w:sz="0" w:space="0" w:color="auto"/>
               <w:top w:val="none" w:sz="0" w:space="0" w:color="auto"/>
+              <w:bottom w:val="none" w:sz="0" w:space="0" w:color="auto"/>
               <w:insideV w:val="none" w:sz="0" w:space="0" w:color="auto"/>
-              <w:left w:val="none" w:sz="0" w:space="0" w:color="auto"/>
-              <w:bottom w:val="none" w:sz="0" w:space="0" w:color="auto"/>
-              <w:insideH w:val="none" w:sz="0" w:space="0" w:color="auto"/>
             </w:tcBorders>
           </w:tcPr>
           <w:p>
@@ -10627,11 +10554,11 @@
             <w:tcW w:type="dxa" w:w="4677"/>
             <w:tcBorders>
               <w:left w:val="single" w:sz="4" w:space="0" w:color="2C3A4A"/>
+              <w:right w:val="none" w:sz="0" w:space="0" w:color="auto"/>
+              <w:insideH w:val="none" w:sz="0" w:space="0" w:color="auto"/>
               <w:top w:val="none" w:sz="0" w:space="0" w:color="auto"/>
+              <w:bottom w:val="none" w:sz="0" w:space="0" w:color="auto"/>
               <w:insideV w:val="none" w:sz="0" w:space="0" w:color="auto"/>
-              <w:bottom w:val="none" w:sz="0" w:space="0" w:color="auto"/>
-              <w:insideH w:val="none" w:sz="0" w:space="0" w:color="auto"/>
-              <w:right w:val="none" w:sz="0" w:space="0" w:color="auto"/>
             </w:tcBorders>
           </w:tcPr>
           <w:p>
@@ -10655,11 +10582,11 @@
             <w:tcW w:type="dxa" w:w="4677"/>
             <w:tcBorders>
               <w:right w:val="single" w:sz="4" w:space="0" w:color="2C3A4A"/>
+              <w:left w:val="none" w:sz="0" w:space="0" w:color="auto"/>
+              <w:insideH w:val="none" w:sz="0" w:space="0" w:color="auto"/>
               <w:top w:val="none" w:sz="0" w:space="0" w:color="auto"/>
+              <w:bottom w:val="none" w:sz="0" w:space="0" w:color="auto"/>
               <w:insideV w:val="none" w:sz="0" w:space="0" w:color="auto"/>
-              <w:left w:val="none" w:sz="0" w:space="0" w:color="auto"/>
-              <w:bottom w:val="none" w:sz="0" w:space="0" w:color="auto"/>
-              <w:insideH w:val="none" w:sz="0" w:space="0" w:color="auto"/>
             </w:tcBorders>
           </w:tcPr>
           <w:p>
@@ -10690,11 +10617,11 @@
             <w:tcW w:type="dxa" w:w="4677"/>
             <w:tcBorders>
               <w:left w:val="single" w:sz="4" w:space="0" w:color="2C3A4A"/>
+              <w:right w:val="none" w:sz="0" w:space="0" w:color="auto"/>
+              <w:insideH w:val="none" w:sz="0" w:space="0" w:color="auto"/>
               <w:top w:val="none" w:sz="0" w:space="0" w:color="auto"/>
+              <w:bottom w:val="none" w:sz="0" w:space="0" w:color="auto"/>
               <w:insideV w:val="none" w:sz="0" w:space="0" w:color="auto"/>
-              <w:bottom w:val="none" w:sz="0" w:space="0" w:color="auto"/>
-              <w:insideH w:val="none" w:sz="0" w:space="0" w:color="auto"/>
-              <w:right w:val="none" w:sz="0" w:space="0" w:color="auto"/>
             </w:tcBorders>
           </w:tcPr>
           <w:p>
@@ -10718,11 +10645,11 @@
             <w:tcW w:type="dxa" w:w="4677"/>
             <w:tcBorders>
               <w:right w:val="single" w:sz="4" w:space="0" w:color="2C3A4A"/>
+              <w:left w:val="none" w:sz="0" w:space="0" w:color="auto"/>
+              <w:insideH w:val="none" w:sz="0" w:space="0" w:color="auto"/>
               <w:top w:val="none" w:sz="0" w:space="0" w:color="auto"/>
+              <w:bottom w:val="none" w:sz="0" w:space="0" w:color="auto"/>
               <w:insideV w:val="none" w:sz="0" w:space="0" w:color="auto"/>
-              <w:left w:val="none" w:sz="0" w:space="0" w:color="auto"/>
-              <w:bottom w:val="none" w:sz="0" w:space="0" w:color="auto"/>
-              <w:insideH w:val="none" w:sz="0" w:space="0" w:color="auto"/>
             </w:tcBorders>
           </w:tcPr>
           <w:p>
@@ -10753,11 +10680,11 @@
             <w:tcW w:type="dxa" w:w="4677"/>
             <w:tcBorders>
               <w:left w:val="single" w:sz="4" w:space="0" w:color="2C3A4A"/>
+              <w:right w:val="none" w:sz="0" w:space="0" w:color="auto"/>
+              <w:insideH w:val="none" w:sz="0" w:space="0" w:color="auto"/>
               <w:top w:val="none" w:sz="0" w:space="0" w:color="auto"/>
+              <w:bottom w:val="none" w:sz="0" w:space="0" w:color="auto"/>
               <w:insideV w:val="none" w:sz="0" w:space="0" w:color="auto"/>
-              <w:bottom w:val="none" w:sz="0" w:space="0" w:color="auto"/>
-              <w:insideH w:val="none" w:sz="0" w:space="0" w:color="auto"/>
-              <w:right w:val="none" w:sz="0" w:space="0" w:color="auto"/>
             </w:tcBorders>
           </w:tcPr>
           <w:p>
@@ -10781,11 +10708,11 @@
             <w:tcW w:type="dxa" w:w="4677"/>
             <w:tcBorders>
               <w:right w:val="single" w:sz="4" w:space="0" w:color="2C3A4A"/>
+              <w:left w:val="none" w:sz="0" w:space="0" w:color="auto"/>
+              <w:insideH w:val="none" w:sz="0" w:space="0" w:color="auto"/>
               <w:top w:val="none" w:sz="0" w:space="0" w:color="auto"/>
+              <w:bottom w:val="none" w:sz="0" w:space="0" w:color="auto"/>
               <w:insideV w:val="none" w:sz="0" w:space="0" w:color="auto"/>
-              <w:left w:val="none" w:sz="0" w:space="0" w:color="auto"/>
-              <w:bottom w:val="none" w:sz="0" w:space="0" w:color="auto"/>
-              <w:insideH w:val="none" w:sz="0" w:space="0" w:color="auto"/>
             </w:tcBorders>
           </w:tcPr>
           <w:p>
@@ -10816,11 +10743,11 @@
             <w:tcW w:type="dxa" w:w="4677"/>
             <w:tcBorders>
               <w:left w:val="single" w:sz="4" w:space="0" w:color="2C3A4A"/>
+              <w:right w:val="none" w:sz="0" w:space="0" w:color="auto"/>
+              <w:insideH w:val="none" w:sz="0" w:space="0" w:color="auto"/>
               <w:top w:val="none" w:sz="0" w:space="0" w:color="auto"/>
+              <w:bottom w:val="none" w:sz="0" w:space="0" w:color="auto"/>
               <w:insideV w:val="none" w:sz="0" w:space="0" w:color="auto"/>
-              <w:bottom w:val="none" w:sz="0" w:space="0" w:color="auto"/>
-              <w:insideH w:val="none" w:sz="0" w:space="0" w:color="auto"/>
-              <w:right w:val="none" w:sz="0" w:space="0" w:color="auto"/>
             </w:tcBorders>
           </w:tcPr>
           <w:p>
@@ -10917,12 +10844,12 @@
           <w:tcPr>
             <w:tcW w:type="dxa" w:w="4677"/>
             <w:tcBorders>
+              <w:top w:val="none" w:sz="0" w:space="0" w:color="auto"/>
+              <w:right w:val="none" w:sz="0" w:space="0" w:color="auto"/>
+              <w:bottom w:val="none" w:sz="0" w:space="0" w:color="auto"/>
+              <w:left w:val="none" w:sz="0" w:space="0" w:color="auto"/>
+              <w:insideH w:val="none" w:sz="0" w:space="0" w:color="auto"/>
               <w:insideV w:val="none" w:sz="0" w:space="0" w:color="auto"/>
-              <w:left w:val="none" w:sz="0" w:space="0" w:color="auto"/>
-              <w:bottom w:val="none" w:sz="0" w:space="0" w:color="auto"/>
-              <w:top w:val="none" w:sz="0" w:space="0" w:color="auto"/>
-              <w:insideH w:val="none" w:sz="0" w:space="0" w:color="auto"/>
-              <w:right w:val="none" w:sz="0" w:space="0" w:color="auto"/>
             </w:tcBorders>
           </w:tcPr>
           <w:p>
@@ -10944,12 +10871,12 @@
           <w:tcPr>
             <w:tcW w:type="dxa" w:w="4677"/>
             <w:tcBorders>
+              <w:top w:val="none" w:sz="0" w:space="0" w:color="auto"/>
+              <w:right w:val="none" w:sz="0" w:space="0" w:color="auto"/>
+              <w:bottom w:val="none" w:sz="0" w:space="0" w:color="auto"/>
+              <w:left w:val="none" w:sz="0" w:space="0" w:color="auto"/>
+              <w:insideH w:val="none" w:sz="0" w:space="0" w:color="auto"/>
               <w:insideV w:val="none" w:sz="0" w:space="0" w:color="auto"/>
-              <w:left w:val="none" w:sz="0" w:space="0" w:color="auto"/>
-              <w:bottom w:val="none" w:sz="0" w:space="0" w:color="auto"/>
-              <w:top w:val="none" w:sz="0" w:space="0" w:color="auto"/>
-              <w:insideH w:val="none" w:sz="0" w:space="0" w:color="auto"/>
-              <w:right w:val="none" w:sz="0" w:space="0" w:color="auto"/>
             </w:tcBorders>
           </w:tcPr>
           <w:p>
@@ -10989,11 +10916,11 @@
             <w:tcW w:type="dxa" w:w="4677"/>
             <w:tcBorders>
               <w:right w:val="single" w:sz="4" w:space="0" w:color="2C3A4A"/>
+              <w:left w:val="none" w:sz="0" w:space="0" w:color="auto"/>
+              <w:insideH w:val="none" w:sz="0" w:space="0" w:color="auto"/>
               <w:top w:val="none" w:sz="0" w:space="0" w:color="auto"/>
+              <w:bottom w:val="none" w:sz="0" w:space="0" w:color="auto"/>
               <w:insideV w:val="none" w:sz="0" w:space="0" w:color="auto"/>
-              <w:left w:val="none" w:sz="0" w:space="0" w:color="auto"/>
-              <w:bottom w:val="none" w:sz="0" w:space="0" w:color="auto"/>
-              <w:insideH w:val="none" w:sz="0" w:space="0" w:color="auto"/>
             </w:tcBorders>
           </w:tcPr>
           <w:p>
@@ -11024,11 +10951,11 @@
             <w:tcW w:type="dxa" w:w="4677"/>
             <w:tcBorders>
               <w:left w:val="single" w:sz="4" w:space="0" w:color="2C3A4A"/>
+              <w:right w:val="none" w:sz="0" w:space="0" w:color="auto"/>
+              <w:insideH w:val="none" w:sz="0" w:space="0" w:color="auto"/>
               <w:top w:val="none" w:sz="0" w:space="0" w:color="auto"/>
+              <w:bottom w:val="none" w:sz="0" w:space="0" w:color="auto"/>
               <w:insideV w:val="none" w:sz="0" w:space="0" w:color="auto"/>
-              <w:bottom w:val="none" w:sz="0" w:space="0" w:color="auto"/>
-              <w:insideH w:val="none" w:sz="0" w:space="0" w:color="auto"/>
-              <w:right w:val="none" w:sz="0" w:space="0" w:color="auto"/>
             </w:tcBorders>
           </w:tcPr>
           <w:p>
@@ -11052,11 +10979,11 @@
             <w:tcW w:type="dxa" w:w="4677"/>
             <w:tcBorders>
               <w:right w:val="single" w:sz="4" w:space="0" w:color="2C3A4A"/>
+              <w:left w:val="none" w:sz="0" w:space="0" w:color="auto"/>
+              <w:insideH w:val="none" w:sz="0" w:space="0" w:color="auto"/>
               <w:top w:val="none" w:sz="0" w:space="0" w:color="auto"/>
+              <w:bottom w:val="none" w:sz="0" w:space="0" w:color="auto"/>
               <w:insideV w:val="none" w:sz="0" w:space="0" w:color="auto"/>
-              <w:left w:val="none" w:sz="0" w:space="0" w:color="auto"/>
-              <w:bottom w:val="none" w:sz="0" w:space="0" w:color="auto"/>
-              <w:insideH w:val="none" w:sz="0" w:space="0" w:color="auto"/>
             </w:tcBorders>
           </w:tcPr>
           <w:p>
@@ -11087,11 +11014,11 @@
             <w:tcW w:type="dxa" w:w="4677"/>
             <w:tcBorders>
               <w:left w:val="single" w:sz="4" w:space="0" w:color="2C3A4A"/>
+              <w:right w:val="none" w:sz="0" w:space="0" w:color="auto"/>
+              <w:insideH w:val="none" w:sz="0" w:space="0" w:color="auto"/>
               <w:top w:val="none" w:sz="0" w:space="0" w:color="auto"/>
+              <w:bottom w:val="none" w:sz="0" w:space="0" w:color="auto"/>
               <w:insideV w:val="none" w:sz="0" w:space="0" w:color="auto"/>
-              <w:bottom w:val="none" w:sz="0" w:space="0" w:color="auto"/>
-              <w:insideH w:val="none" w:sz="0" w:space="0" w:color="auto"/>
-              <w:right w:val="none" w:sz="0" w:space="0" w:color="auto"/>
             </w:tcBorders>
           </w:tcPr>
           <w:p>
@@ -11115,11 +11042,11 @@
             <w:tcW w:type="dxa" w:w="4677"/>
             <w:tcBorders>
               <w:right w:val="single" w:sz="4" w:space="0" w:color="2C3A4A"/>
+              <w:left w:val="none" w:sz="0" w:space="0" w:color="auto"/>
+              <w:insideH w:val="none" w:sz="0" w:space="0" w:color="auto"/>
               <w:top w:val="none" w:sz="0" w:space="0" w:color="auto"/>
+              <w:bottom w:val="none" w:sz="0" w:space="0" w:color="auto"/>
               <w:insideV w:val="none" w:sz="0" w:space="0" w:color="auto"/>
-              <w:left w:val="none" w:sz="0" w:space="0" w:color="auto"/>
-              <w:bottom w:val="none" w:sz="0" w:space="0" w:color="auto"/>
-              <w:insideH w:val="none" w:sz="0" w:space="0" w:color="auto"/>
             </w:tcBorders>
           </w:tcPr>
           <w:p>
@@ -11150,11 +11077,11 @@
             <w:tcW w:type="dxa" w:w="4677"/>
             <w:tcBorders>
               <w:left w:val="single" w:sz="4" w:space="0" w:color="2C3A4A"/>
+              <w:right w:val="none" w:sz="0" w:space="0" w:color="auto"/>
+              <w:insideH w:val="none" w:sz="0" w:space="0" w:color="auto"/>
               <w:top w:val="none" w:sz="0" w:space="0" w:color="auto"/>
+              <w:bottom w:val="none" w:sz="0" w:space="0" w:color="auto"/>
               <w:insideV w:val="none" w:sz="0" w:space="0" w:color="auto"/>
-              <w:bottom w:val="none" w:sz="0" w:space="0" w:color="auto"/>
-              <w:insideH w:val="none" w:sz="0" w:space="0" w:color="auto"/>
-              <w:right w:val="none" w:sz="0" w:space="0" w:color="auto"/>
             </w:tcBorders>
           </w:tcPr>
           <w:p>
@@ -11178,11 +11105,11 @@
             <w:tcW w:type="dxa" w:w="4677"/>
             <w:tcBorders>
               <w:right w:val="single" w:sz="4" w:space="0" w:color="2C3A4A"/>
+              <w:left w:val="none" w:sz="0" w:space="0" w:color="auto"/>
+              <w:insideH w:val="none" w:sz="0" w:space="0" w:color="auto"/>
               <w:top w:val="none" w:sz="0" w:space="0" w:color="auto"/>
+              <w:bottom w:val="none" w:sz="0" w:space="0" w:color="auto"/>
               <w:insideV w:val="none" w:sz="0" w:space="0" w:color="auto"/>
-              <w:left w:val="none" w:sz="0" w:space="0" w:color="auto"/>
-              <w:bottom w:val="none" w:sz="0" w:space="0" w:color="auto"/>
-              <w:insideH w:val="none" w:sz="0" w:space="0" w:color="auto"/>
             </w:tcBorders>
           </w:tcPr>
           <w:p>
@@ -11213,11 +11140,11 @@
             <w:tcW w:type="dxa" w:w="4677"/>
             <w:tcBorders>
               <w:left w:val="single" w:sz="4" w:space="0" w:color="2C3A4A"/>
+              <w:right w:val="none" w:sz="0" w:space="0" w:color="auto"/>
+              <w:insideH w:val="none" w:sz="0" w:space="0" w:color="auto"/>
               <w:top w:val="none" w:sz="0" w:space="0" w:color="auto"/>
+              <w:bottom w:val="none" w:sz="0" w:space="0" w:color="auto"/>
               <w:insideV w:val="none" w:sz="0" w:space="0" w:color="auto"/>
-              <w:bottom w:val="none" w:sz="0" w:space="0" w:color="auto"/>
-              <w:insideH w:val="none" w:sz="0" w:space="0" w:color="auto"/>
-              <w:right w:val="none" w:sz="0" w:space="0" w:color="auto"/>
             </w:tcBorders>
           </w:tcPr>
           <w:p>
@@ -11241,11 +11168,11 @@
             <w:tcW w:type="dxa" w:w="4677"/>
             <w:tcBorders>
               <w:right w:val="single" w:sz="4" w:space="0" w:color="2C3A4A"/>
+              <w:left w:val="none" w:sz="0" w:space="0" w:color="auto"/>
+              <w:insideH w:val="none" w:sz="0" w:space="0" w:color="auto"/>
               <w:top w:val="none" w:sz="0" w:space="0" w:color="auto"/>
+              <w:bottom w:val="none" w:sz="0" w:space="0" w:color="auto"/>
               <w:insideV w:val="none" w:sz="0" w:space="0" w:color="auto"/>
-              <w:left w:val="none" w:sz="0" w:space="0" w:color="auto"/>
-              <w:bottom w:val="none" w:sz="0" w:space="0" w:color="auto"/>
-              <w:insideH w:val="none" w:sz="0" w:space="0" w:color="auto"/>
             </w:tcBorders>
           </w:tcPr>
           <w:p>
@@ -11276,11 +11203,11 @@
             <w:tcW w:type="dxa" w:w="4677"/>
             <w:tcBorders>
               <w:left w:val="single" w:sz="4" w:space="0" w:color="2C3A4A"/>
+              <w:right w:val="none" w:sz="0" w:space="0" w:color="auto"/>
+              <w:insideH w:val="none" w:sz="0" w:space="0" w:color="auto"/>
               <w:top w:val="none" w:sz="0" w:space="0" w:color="auto"/>
+              <w:bottom w:val="none" w:sz="0" w:space="0" w:color="auto"/>
               <w:insideV w:val="none" w:sz="0" w:space="0" w:color="auto"/>
-              <w:bottom w:val="none" w:sz="0" w:space="0" w:color="auto"/>
-              <w:insideH w:val="none" w:sz="0" w:space="0" w:color="auto"/>
-              <w:right w:val="none" w:sz="0" w:space="0" w:color="auto"/>
             </w:tcBorders>
           </w:tcPr>
           <w:p>
@@ -11304,11 +11231,11 @@
             <w:tcW w:type="dxa" w:w="4677"/>
             <w:tcBorders>
               <w:right w:val="single" w:sz="4" w:space="0" w:color="2C3A4A"/>
+              <w:left w:val="none" w:sz="0" w:space="0" w:color="auto"/>
+              <w:insideH w:val="none" w:sz="0" w:space="0" w:color="auto"/>
               <w:top w:val="none" w:sz="0" w:space="0" w:color="auto"/>
+              <w:bottom w:val="none" w:sz="0" w:space="0" w:color="auto"/>
               <w:insideV w:val="none" w:sz="0" w:space="0" w:color="auto"/>
-              <w:left w:val="none" w:sz="0" w:space="0" w:color="auto"/>
-              <w:bottom w:val="none" w:sz="0" w:space="0" w:color="auto"/>
-              <w:insideH w:val="none" w:sz="0" w:space="0" w:color="auto"/>
             </w:tcBorders>
           </w:tcPr>
           <w:p>
@@ -11339,11 +11266,11 @@
             <w:tcW w:type="dxa" w:w="4677"/>
             <w:tcBorders>
               <w:left w:val="single" w:sz="4" w:space="0" w:color="2C3A4A"/>
+              <w:right w:val="none" w:sz="0" w:space="0" w:color="auto"/>
+              <w:insideH w:val="none" w:sz="0" w:space="0" w:color="auto"/>
               <w:top w:val="none" w:sz="0" w:space="0" w:color="auto"/>
+              <w:bottom w:val="none" w:sz="0" w:space="0" w:color="auto"/>
               <w:insideV w:val="none" w:sz="0" w:space="0" w:color="auto"/>
-              <w:bottom w:val="none" w:sz="0" w:space="0" w:color="auto"/>
-              <w:insideH w:val="none" w:sz="0" w:space="0" w:color="auto"/>
-              <w:right w:val="none" w:sz="0" w:space="0" w:color="auto"/>
             </w:tcBorders>
           </w:tcPr>
           <w:p>
@@ -11905,11 +11832,11 @@
             <w:tcW w:type="dxa" w:w="4535"/>
             <w:tcBorders>
               <w:bottom w:val="single" w:sz="12" w:space="0" w:color="A07820"/>
+              <w:right w:val="none" w:sz="0" w:space="0" w:color="auto"/>
+              <w:left w:val="none" w:sz="0" w:space="0" w:color="auto"/>
+              <w:insideH w:val="none" w:sz="0" w:space="0" w:color="auto"/>
               <w:top w:val="none" w:sz="0" w:space="0" w:color="auto"/>
               <w:insideV w:val="none" w:sz="0" w:space="0" w:color="auto"/>
-              <w:left w:val="none" w:sz="0" w:space="0" w:color="auto"/>
-              <w:insideH w:val="none" w:sz="0" w:space="0" w:color="auto"/>
-              <w:right w:val="none" w:sz="0" w:space="0" w:color="auto"/>
             </w:tcBorders>
           </w:tcPr>
           <w:p>
@@ -12109,12 +12036,12 @@
           <w:tcPr>
             <w:tcW w:type="dxa" w:w="4677"/>
             <w:tcBorders>
+              <w:top w:val="none" w:sz="0" w:space="0" w:color="auto"/>
+              <w:right w:val="none" w:sz="0" w:space="0" w:color="auto"/>
+              <w:bottom w:val="none" w:sz="0" w:space="0" w:color="auto"/>
+              <w:left w:val="none" w:sz="0" w:space="0" w:color="auto"/>
+              <w:insideH w:val="none" w:sz="0" w:space="0" w:color="auto"/>
               <w:insideV w:val="none" w:sz="0" w:space="0" w:color="auto"/>
-              <w:left w:val="none" w:sz="0" w:space="0" w:color="auto"/>
-              <w:bottom w:val="none" w:sz="0" w:space="0" w:color="auto"/>
-              <w:top w:val="none" w:sz="0" w:space="0" w:color="auto"/>
-              <w:insideH w:val="none" w:sz="0" w:space="0" w:color="auto"/>
-              <w:right w:val="none" w:sz="0" w:space="0" w:color="auto"/>
             </w:tcBorders>
           </w:tcPr>
           <w:p>
@@ -12136,12 +12063,12 @@
           <w:tcPr>
             <w:tcW w:type="dxa" w:w="4677"/>
             <w:tcBorders>
+              <w:top w:val="none" w:sz="0" w:space="0" w:color="auto"/>
+              <w:right w:val="none" w:sz="0" w:space="0" w:color="auto"/>
+              <w:bottom w:val="none" w:sz="0" w:space="0" w:color="auto"/>
+              <w:left w:val="none" w:sz="0" w:space="0" w:color="auto"/>
+              <w:insideH w:val="none" w:sz="0" w:space="0" w:color="auto"/>
               <w:insideV w:val="none" w:sz="0" w:space="0" w:color="auto"/>
-              <w:left w:val="none" w:sz="0" w:space="0" w:color="auto"/>
-              <w:bottom w:val="none" w:sz="0" w:space="0" w:color="auto"/>
-              <w:top w:val="none" w:sz="0" w:space="0" w:color="auto"/>
-              <w:insideH w:val="none" w:sz="0" w:space="0" w:color="auto"/>
-              <w:right w:val="none" w:sz="0" w:space="0" w:color="auto"/>
             </w:tcBorders>
           </w:tcPr>
           <w:p>
@@ -12181,11 +12108,11 @@
             <w:tcW w:type="dxa" w:w="4677"/>
             <w:tcBorders>
               <w:right w:val="single" w:sz="4" w:space="0" w:color="2C3A4A"/>
+              <w:left w:val="none" w:sz="0" w:space="0" w:color="auto"/>
+              <w:insideH w:val="none" w:sz="0" w:space="0" w:color="auto"/>
               <w:top w:val="none" w:sz="0" w:space="0" w:color="auto"/>
+              <w:bottom w:val="none" w:sz="0" w:space="0" w:color="auto"/>
               <w:insideV w:val="none" w:sz="0" w:space="0" w:color="auto"/>
-              <w:left w:val="none" w:sz="0" w:space="0" w:color="auto"/>
-              <w:bottom w:val="none" w:sz="0" w:space="0" w:color="auto"/>
-              <w:insideH w:val="none" w:sz="0" w:space="0" w:color="auto"/>
             </w:tcBorders>
           </w:tcPr>
           <w:p>
@@ -12216,11 +12143,11 @@
             <w:tcW w:type="dxa" w:w="4677"/>
             <w:tcBorders>
               <w:left w:val="single" w:sz="4" w:space="0" w:color="2C3A4A"/>
+              <w:right w:val="none" w:sz="0" w:space="0" w:color="auto"/>
+              <w:insideH w:val="none" w:sz="0" w:space="0" w:color="auto"/>
               <w:top w:val="none" w:sz="0" w:space="0" w:color="auto"/>
+              <w:bottom w:val="none" w:sz="0" w:space="0" w:color="auto"/>
               <w:insideV w:val="none" w:sz="0" w:space="0" w:color="auto"/>
-              <w:bottom w:val="none" w:sz="0" w:space="0" w:color="auto"/>
-              <w:insideH w:val="none" w:sz="0" w:space="0" w:color="auto"/>
-              <w:right w:val="none" w:sz="0" w:space="0" w:color="auto"/>
             </w:tcBorders>
           </w:tcPr>
           <w:p>
@@ -12244,11 +12171,11 @@
             <w:tcW w:type="dxa" w:w="4677"/>
             <w:tcBorders>
               <w:right w:val="single" w:sz="4" w:space="0" w:color="2C3A4A"/>
+              <w:left w:val="none" w:sz="0" w:space="0" w:color="auto"/>
+              <w:insideH w:val="none" w:sz="0" w:space="0" w:color="auto"/>
               <w:top w:val="none" w:sz="0" w:space="0" w:color="auto"/>
+              <w:bottom w:val="none" w:sz="0" w:space="0" w:color="auto"/>
               <w:insideV w:val="none" w:sz="0" w:space="0" w:color="auto"/>
-              <w:left w:val="none" w:sz="0" w:space="0" w:color="auto"/>
-              <w:bottom w:val="none" w:sz="0" w:space="0" w:color="auto"/>
-              <w:insideH w:val="none" w:sz="0" w:space="0" w:color="auto"/>
             </w:tcBorders>
           </w:tcPr>
           <w:p>
@@ -12279,11 +12206,11 @@
             <w:tcW w:type="dxa" w:w="4677"/>
             <w:tcBorders>
               <w:left w:val="single" w:sz="4" w:space="0" w:color="2C3A4A"/>
+              <w:right w:val="none" w:sz="0" w:space="0" w:color="auto"/>
+              <w:insideH w:val="none" w:sz="0" w:space="0" w:color="auto"/>
               <w:top w:val="none" w:sz="0" w:space="0" w:color="auto"/>
+              <w:bottom w:val="none" w:sz="0" w:space="0" w:color="auto"/>
               <w:insideV w:val="none" w:sz="0" w:space="0" w:color="auto"/>
-              <w:bottom w:val="none" w:sz="0" w:space="0" w:color="auto"/>
-              <w:insideH w:val="none" w:sz="0" w:space="0" w:color="auto"/>
-              <w:right w:val="none" w:sz="0" w:space="0" w:color="auto"/>
             </w:tcBorders>
           </w:tcPr>
           <w:p>
@@ -12307,11 +12234,11 @@
             <w:tcW w:type="dxa" w:w="4677"/>
             <w:tcBorders>
               <w:right w:val="single" w:sz="4" w:space="0" w:color="2C3A4A"/>
+              <w:left w:val="none" w:sz="0" w:space="0" w:color="auto"/>
+              <w:insideH w:val="none" w:sz="0" w:space="0" w:color="auto"/>
               <w:top w:val="none" w:sz="0" w:space="0" w:color="auto"/>
+              <w:bottom w:val="none" w:sz="0" w:space="0" w:color="auto"/>
               <w:insideV w:val="none" w:sz="0" w:space="0" w:color="auto"/>
-              <w:left w:val="none" w:sz="0" w:space="0" w:color="auto"/>
-              <w:bottom w:val="none" w:sz="0" w:space="0" w:color="auto"/>
-              <w:insideH w:val="none" w:sz="0" w:space="0" w:color="auto"/>
             </w:tcBorders>
           </w:tcPr>
           <w:p>
@@ -12342,11 +12269,11 @@
             <w:tcW w:type="dxa" w:w="4677"/>
             <w:tcBorders>
               <w:left w:val="single" w:sz="4" w:space="0" w:color="2C3A4A"/>
+              <w:right w:val="none" w:sz="0" w:space="0" w:color="auto"/>
+              <w:insideH w:val="none" w:sz="0" w:space="0" w:color="auto"/>
               <w:top w:val="none" w:sz="0" w:space="0" w:color="auto"/>
+              <w:bottom w:val="none" w:sz="0" w:space="0" w:color="auto"/>
               <w:insideV w:val="none" w:sz="0" w:space="0" w:color="auto"/>
-              <w:bottom w:val="none" w:sz="0" w:space="0" w:color="auto"/>
-              <w:insideH w:val="none" w:sz="0" w:space="0" w:color="auto"/>
-              <w:right w:val="none" w:sz="0" w:space="0" w:color="auto"/>
             </w:tcBorders>
           </w:tcPr>
           <w:p>
@@ -12370,11 +12297,11 @@
             <w:tcW w:type="dxa" w:w="4677"/>
             <w:tcBorders>
               <w:right w:val="single" w:sz="4" w:space="0" w:color="2C3A4A"/>
+              <w:left w:val="none" w:sz="0" w:space="0" w:color="auto"/>
+              <w:insideH w:val="none" w:sz="0" w:space="0" w:color="auto"/>
               <w:top w:val="none" w:sz="0" w:space="0" w:color="auto"/>
+              <w:bottom w:val="none" w:sz="0" w:space="0" w:color="auto"/>
               <w:insideV w:val="none" w:sz="0" w:space="0" w:color="auto"/>
-              <w:left w:val="none" w:sz="0" w:space="0" w:color="auto"/>
-              <w:bottom w:val="none" w:sz="0" w:space="0" w:color="auto"/>
-              <w:insideH w:val="none" w:sz="0" w:space="0" w:color="auto"/>
             </w:tcBorders>
           </w:tcPr>
           <w:p>
@@ -12405,11 +12332,11 @@
             <w:tcW w:type="dxa" w:w="4677"/>
             <w:tcBorders>
               <w:left w:val="single" w:sz="4" w:space="0" w:color="2C3A4A"/>
+              <w:right w:val="none" w:sz="0" w:space="0" w:color="auto"/>
+              <w:insideH w:val="none" w:sz="0" w:space="0" w:color="auto"/>
               <w:top w:val="none" w:sz="0" w:space="0" w:color="auto"/>
+              <w:bottom w:val="none" w:sz="0" w:space="0" w:color="auto"/>
               <w:insideV w:val="none" w:sz="0" w:space="0" w:color="auto"/>
-              <w:bottom w:val="none" w:sz="0" w:space="0" w:color="auto"/>
-              <w:insideH w:val="none" w:sz="0" w:space="0" w:color="auto"/>
-              <w:right w:val="none" w:sz="0" w:space="0" w:color="auto"/>
             </w:tcBorders>
           </w:tcPr>
           <w:p>
@@ -13798,12 +13725,12 @@
           <w:tcPr>
             <w:tcW w:type="dxa" w:w="4677"/>
             <w:tcBorders>
+              <w:top w:val="none" w:sz="0" w:space="0" w:color="auto"/>
+              <w:right w:val="none" w:sz="0" w:space="0" w:color="auto"/>
+              <w:bottom w:val="none" w:sz="0" w:space="0" w:color="auto"/>
+              <w:left w:val="none" w:sz="0" w:space="0" w:color="auto"/>
+              <w:insideH w:val="none" w:sz="0" w:space="0" w:color="auto"/>
               <w:insideV w:val="none" w:sz="0" w:space="0" w:color="auto"/>
-              <w:left w:val="none" w:sz="0" w:space="0" w:color="auto"/>
-              <w:bottom w:val="none" w:sz="0" w:space="0" w:color="auto"/>
-              <w:top w:val="none" w:sz="0" w:space="0" w:color="auto"/>
-              <w:insideH w:val="none" w:sz="0" w:space="0" w:color="auto"/>
-              <w:right w:val="none" w:sz="0" w:space="0" w:color="auto"/>
             </w:tcBorders>
           </w:tcPr>
           <w:p>
@@ -13825,12 +13752,12 @@
           <w:tcPr>
             <w:tcW w:type="dxa" w:w="4677"/>
             <w:tcBorders>
+              <w:top w:val="none" w:sz="0" w:space="0" w:color="auto"/>
+              <w:right w:val="none" w:sz="0" w:space="0" w:color="auto"/>
+              <w:bottom w:val="none" w:sz="0" w:space="0" w:color="auto"/>
+              <w:left w:val="none" w:sz="0" w:space="0" w:color="auto"/>
+              <w:insideH w:val="none" w:sz="0" w:space="0" w:color="auto"/>
               <w:insideV w:val="none" w:sz="0" w:space="0" w:color="auto"/>
-              <w:left w:val="none" w:sz="0" w:space="0" w:color="auto"/>
-              <w:bottom w:val="none" w:sz="0" w:space="0" w:color="auto"/>
-              <w:top w:val="none" w:sz="0" w:space="0" w:color="auto"/>
-              <w:insideH w:val="none" w:sz="0" w:space="0" w:color="auto"/>
-              <w:right w:val="none" w:sz="0" w:space="0" w:color="auto"/>
             </w:tcBorders>
           </w:tcPr>
           <w:p>
@@ -13870,11 +13797,11 @@
             <w:tcW w:type="dxa" w:w="4677"/>
             <w:tcBorders>
               <w:right w:val="single" w:sz="4" w:space="0" w:color="2C3A4A"/>
+              <w:left w:val="none" w:sz="0" w:space="0" w:color="auto"/>
+              <w:insideH w:val="none" w:sz="0" w:space="0" w:color="auto"/>
               <w:top w:val="none" w:sz="0" w:space="0" w:color="auto"/>
+              <w:bottom w:val="none" w:sz="0" w:space="0" w:color="auto"/>
               <w:insideV w:val="none" w:sz="0" w:space="0" w:color="auto"/>
-              <w:left w:val="none" w:sz="0" w:space="0" w:color="auto"/>
-              <w:bottom w:val="none" w:sz="0" w:space="0" w:color="auto"/>
-              <w:insideH w:val="none" w:sz="0" w:space="0" w:color="auto"/>
             </w:tcBorders>
           </w:tcPr>
           <w:p>
@@ -13905,11 +13832,11 @@
             <w:tcW w:type="dxa" w:w="4677"/>
             <w:tcBorders>
               <w:left w:val="single" w:sz="4" w:space="0" w:color="2C3A4A"/>
+              <w:right w:val="none" w:sz="0" w:space="0" w:color="auto"/>
+              <w:insideH w:val="none" w:sz="0" w:space="0" w:color="auto"/>
               <w:top w:val="none" w:sz="0" w:space="0" w:color="auto"/>
+              <w:bottom w:val="none" w:sz="0" w:space="0" w:color="auto"/>
               <w:insideV w:val="none" w:sz="0" w:space="0" w:color="auto"/>
-              <w:bottom w:val="none" w:sz="0" w:space="0" w:color="auto"/>
-              <w:insideH w:val="none" w:sz="0" w:space="0" w:color="auto"/>
-              <w:right w:val="none" w:sz="0" w:space="0" w:color="auto"/>
             </w:tcBorders>
           </w:tcPr>
           <w:p>
@@ -13933,11 +13860,11 @@
             <w:tcW w:type="dxa" w:w="4677"/>
             <w:tcBorders>
               <w:right w:val="single" w:sz="4" w:space="0" w:color="2C3A4A"/>
+              <w:left w:val="none" w:sz="0" w:space="0" w:color="auto"/>
+              <w:insideH w:val="none" w:sz="0" w:space="0" w:color="auto"/>
               <w:top w:val="none" w:sz="0" w:space="0" w:color="auto"/>
+              <w:bottom w:val="none" w:sz="0" w:space="0" w:color="auto"/>
               <w:insideV w:val="none" w:sz="0" w:space="0" w:color="auto"/>
-              <w:left w:val="none" w:sz="0" w:space="0" w:color="auto"/>
-              <w:bottom w:val="none" w:sz="0" w:space="0" w:color="auto"/>
-              <w:insideH w:val="none" w:sz="0" w:space="0" w:color="auto"/>
             </w:tcBorders>
           </w:tcPr>
           <w:p>
@@ -13968,11 +13895,11 @@
             <w:tcW w:type="dxa" w:w="4677"/>
             <w:tcBorders>
               <w:left w:val="single" w:sz="4" w:space="0" w:color="2C3A4A"/>
+              <w:right w:val="none" w:sz="0" w:space="0" w:color="auto"/>
+              <w:insideH w:val="none" w:sz="0" w:space="0" w:color="auto"/>
               <w:top w:val="none" w:sz="0" w:space="0" w:color="auto"/>
+              <w:bottom w:val="none" w:sz="0" w:space="0" w:color="auto"/>
               <w:insideV w:val="none" w:sz="0" w:space="0" w:color="auto"/>
-              <w:bottom w:val="none" w:sz="0" w:space="0" w:color="auto"/>
-              <w:insideH w:val="none" w:sz="0" w:space="0" w:color="auto"/>
-              <w:right w:val="none" w:sz="0" w:space="0" w:color="auto"/>
             </w:tcBorders>
           </w:tcPr>
           <w:p>
@@ -13996,11 +13923,11 @@
             <w:tcW w:type="dxa" w:w="4677"/>
             <w:tcBorders>
               <w:right w:val="single" w:sz="4" w:space="0" w:color="2C3A4A"/>
+              <w:left w:val="none" w:sz="0" w:space="0" w:color="auto"/>
+              <w:insideH w:val="none" w:sz="0" w:space="0" w:color="auto"/>
               <w:top w:val="none" w:sz="0" w:space="0" w:color="auto"/>
+              <w:bottom w:val="none" w:sz="0" w:space="0" w:color="auto"/>
               <w:insideV w:val="none" w:sz="0" w:space="0" w:color="auto"/>
-              <w:left w:val="none" w:sz="0" w:space="0" w:color="auto"/>
-              <w:bottom w:val="none" w:sz="0" w:space="0" w:color="auto"/>
-              <w:insideH w:val="none" w:sz="0" w:space="0" w:color="auto"/>
             </w:tcBorders>
           </w:tcPr>
           <w:p>
@@ -14031,11 +13958,11 @@
             <w:tcW w:type="dxa" w:w="4677"/>
             <w:tcBorders>
               <w:left w:val="single" w:sz="4" w:space="0" w:color="2C3A4A"/>
+              <w:right w:val="none" w:sz="0" w:space="0" w:color="auto"/>
+              <w:insideH w:val="none" w:sz="0" w:space="0" w:color="auto"/>
               <w:top w:val="none" w:sz="0" w:space="0" w:color="auto"/>
+              <w:bottom w:val="none" w:sz="0" w:space="0" w:color="auto"/>
               <w:insideV w:val="none" w:sz="0" w:space="0" w:color="auto"/>
-              <w:bottom w:val="none" w:sz="0" w:space="0" w:color="auto"/>
-              <w:insideH w:val="none" w:sz="0" w:space="0" w:color="auto"/>
-              <w:right w:val="none" w:sz="0" w:space="0" w:color="auto"/>
             </w:tcBorders>
           </w:tcPr>
           <w:p>
@@ -14059,11 +13986,11 @@
             <w:tcW w:type="dxa" w:w="4677"/>
             <w:tcBorders>
               <w:right w:val="single" w:sz="4" w:space="0" w:color="2C3A4A"/>
+              <w:left w:val="none" w:sz="0" w:space="0" w:color="auto"/>
+              <w:insideH w:val="none" w:sz="0" w:space="0" w:color="auto"/>
               <w:top w:val="none" w:sz="0" w:space="0" w:color="auto"/>
+              <w:bottom w:val="none" w:sz="0" w:space="0" w:color="auto"/>
               <w:insideV w:val="none" w:sz="0" w:space="0" w:color="auto"/>
-              <w:left w:val="none" w:sz="0" w:space="0" w:color="auto"/>
-              <w:bottom w:val="none" w:sz="0" w:space="0" w:color="auto"/>
-              <w:insideH w:val="none" w:sz="0" w:space="0" w:color="auto"/>
             </w:tcBorders>
           </w:tcPr>
           <w:p>
@@ -14094,11 +14021,11 @@
             <w:tcW w:type="dxa" w:w="4677"/>
             <w:tcBorders>
               <w:left w:val="single" w:sz="4" w:space="0" w:color="2C3A4A"/>
+              <w:right w:val="none" w:sz="0" w:space="0" w:color="auto"/>
+              <w:insideH w:val="none" w:sz="0" w:space="0" w:color="auto"/>
               <w:top w:val="none" w:sz="0" w:space="0" w:color="auto"/>
+              <w:bottom w:val="none" w:sz="0" w:space="0" w:color="auto"/>
               <w:insideV w:val="none" w:sz="0" w:space="0" w:color="auto"/>
-              <w:bottom w:val="none" w:sz="0" w:space="0" w:color="auto"/>
-              <w:insideH w:val="none" w:sz="0" w:space="0" w:color="auto"/>
-              <w:right w:val="none" w:sz="0" w:space="0" w:color="auto"/>
             </w:tcBorders>
           </w:tcPr>
           <w:p>
@@ -16326,11 +16253,11 @@
             <w:tcW w:type="dxa" w:w="4535"/>
             <w:tcBorders>
               <w:bottom w:val="single" w:sz="12" w:space="0" w:color="A07820"/>
+              <w:right w:val="none" w:sz="0" w:space="0" w:color="auto"/>
+              <w:left w:val="none" w:sz="0" w:space="0" w:color="auto"/>
+              <w:insideH w:val="none" w:sz="0" w:space="0" w:color="auto"/>
               <w:top w:val="none" w:sz="0" w:space="0" w:color="auto"/>
               <w:insideV w:val="none" w:sz="0" w:space="0" w:color="auto"/>
-              <w:left w:val="none" w:sz="0" w:space="0" w:color="auto"/>
-              <w:insideH w:val="none" w:sz="0" w:space="0" w:color="auto"/>
-              <w:right w:val="none" w:sz="0" w:space="0" w:color="auto"/>
             </w:tcBorders>
           </w:tcPr>
           <w:p>
@@ -19728,11 +19655,11 @@
             <w:tcW w:type="dxa" w:w="4535"/>
             <w:tcBorders>
               <w:bottom w:val="single" w:sz="12" w:space="0" w:color="A07820"/>
+              <w:right w:val="none" w:sz="0" w:space="0" w:color="auto"/>
+              <w:left w:val="none" w:sz="0" w:space="0" w:color="auto"/>
+              <w:insideH w:val="none" w:sz="0" w:space="0" w:color="auto"/>
               <w:top w:val="none" w:sz="0" w:space="0" w:color="auto"/>
               <w:insideV w:val="none" w:sz="0" w:space="0" w:color="auto"/>
-              <w:left w:val="none" w:sz="0" w:space="0" w:color="auto"/>
-              <w:insideH w:val="none" w:sz="0" w:space="0" w:color="auto"/>
-              <w:right w:val="none" w:sz="0" w:space="0" w:color="auto"/>
             </w:tcBorders>
           </w:tcPr>
           <w:p>
@@ -21325,11 +21252,11 @@
             <w:tcW w:type="dxa" w:w="4535"/>
             <w:tcBorders>
               <w:bottom w:val="single" w:sz="12" w:space="0" w:color="A07820"/>
+              <w:right w:val="none" w:sz="0" w:space="0" w:color="auto"/>
+              <w:left w:val="none" w:sz="0" w:space="0" w:color="auto"/>
+              <w:insideH w:val="none" w:sz="0" w:space="0" w:color="auto"/>
               <w:top w:val="none" w:sz="0" w:space="0" w:color="auto"/>
               <w:insideV w:val="none" w:sz="0" w:space="0" w:color="auto"/>
-              <w:left w:val="none" w:sz="0" w:space="0" w:color="auto"/>
-              <w:insideH w:val="none" w:sz="0" w:space="0" w:color="auto"/>
-              <w:right w:val="none" w:sz="0" w:space="0" w:color="auto"/>
             </w:tcBorders>
           </w:tcPr>
           <w:p>

</xml_diff>